<commit_message>
fix(dispatch): show joint schedule in ssu collab dispatch and update fgmu docx generator with contact_no, 10 personnel, and empty default remarks
</commit_message>
<xml_diff>
--- a/public/templates/FGMU Job Request Form.docx
+++ b/public/templates/FGMU Job Request Form.docx
@@ -438,6 +438,14 @@
               </w:rPr>
               <w:t>Contact No.</w:t>
             </w:r>
+            <w:r>
+              <w:rPr>
+                <w:rFonts w:ascii="Arial Narrow" w:hAnsi="Arial Narrow"/>
+                <w:sz w:val="18"/>
+                <w:szCs w:val="18"/>
+              </w:rPr>
+              <w:t xml:space="preserve"> {contact_no}</w:t>
+            </w:r>
           </w:p>
         </w:tc>
       </w:tr>
@@ -692,25 +700,7 @@
                 <w:sz w:val="20"/>
                 <w:szCs w:val="20"/>
               </w:rPr>
-              <w:t>{</w:t>
-            </w:r>
-            <w:proofErr w:type="spellStart"/>
-            <w:r>
-              <w:rPr>
-                <w:rFonts w:ascii="Arial Narrow" w:hAnsi="Arial Narrow"/>
-                <w:sz w:val="20"/>
-                <w:szCs w:val="20"/>
-              </w:rPr>
-              <w:t>Working_days</w:t>
-            </w:r>
-            <w:proofErr w:type="spellEnd"/>
-            <w:r>
-              <w:rPr>
-                <w:rFonts w:ascii="Arial Narrow" w:hAnsi="Arial Narrow"/>
-                <w:sz w:val="20"/>
-                <w:szCs w:val="20"/>
-              </w:rPr>
-              <w:t>}</w:t>
+              <w:t>{Working_days}</w:t>
             </w:r>
           </w:p>
         </w:tc>
@@ -812,7 +802,7 @@
                 </mc:Choice>
                 <mc:Fallback>
                   <w:pict>
-                    <v:rect w14:anchorId="7B1D7CF3" id="Rectangle 38" o:spid="_x0000_s1026" style="position:absolute;margin-left:.5pt;margin-top:1.6pt;width:14.4pt;height:8.7pt;z-index:251653120;visibility:visible;mso-wrap-style:square;mso-width-percent:0;mso-height-percent:0;mso-wrap-distance-left:9pt;mso-wrap-distance-top:0;mso-wrap-distance-right:9pt;mso-wrap-distance-bottom:0;mso-position-horizontal:absolute;mso-position-horizontal-relative:text;mso-position-vertical:absolute;mso-position-vertical-relative:text;mso-width-percent:0;mso-height-percent:0;mso-width-relative:margin;mso-height-relative:margin;v-text-anchor:middle" o:gfxdata="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" filled="f" strokecolor="black [3213]" strokeweight="1pt"/>
+                    <v:rect w14:anchorId="23CD97A0" id="Rectangle 38" o:spid="_x0000_s1026" style="position:absolute;margin-left:.5pt;margin-top:1.6pt;width:14.4pt;height:8.7pt;z-index:251653120;visibility:visible;mso-wrap-style:square;mso-width-percent:0;mso-height-percent:0;mso-wrap-distance-left:9pt;mso-wrap-distance-top:0;mso-wrap-distance-right:9pt;mso-wrap-distance-bottom:0;mso-position-horizontal:absolute;mso-position-horizontal-relative:text;mso-position-vertical:absolute;mso-position-vertical-relative:text;mso-width-percent:0;mso-height-percent:0;mso-width-relative:margin;mso-height-relative:margin;v-text-anchor:middle" o:gfxdata="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" filled="f" strokecolor="black [3213]" strokeweight="1pt"/>
                   </w:pict>
                 </mc:Fallback>
               </mc:AlternateContent>
@@ -919,7 +909,7 @@
                 </mc:Choice>
                 <mc:Fallback>
                   <w:pict>
-                    <v:rect w14:anchorId="33E15EBF" id="Rectangle 40" o:spid="_x0000_s1026" style="position:absolute;margin-left:.4pt;margin-top:1.1pt;width:14.4pt;height:8.7pt;z-index:251654144;visibility:visible;mso-wrap-style:square;mso-width-percent:0;mso-height-percent:0;mso-wrap-distance-left:9pt;mso-wrap-distance-top:0;mso-wrap-distance-right:9pt;mso-wrap-distance-bottom:0;mso-position-horizontal:absolute;mso-position-horizontal-relative:text;mso-position-vertical:absolute;mso-position-vertical-relative:text;mso-width-percent:0;mso-height-percent:0;mso-width-relative:margin;mso-height-relative:margin;v-text-anchor:middle" o:gfxdata="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" filled="f" strokecolor="black [3213]" strokeweight="1pt"/>
+                    <v:rect w14:anchorId="64DAB372" id="Rectangle 40" o:spid="_x0000_s1026" style="position:absolute;margin-left:.4pt;margin-top:1.1pt;width:14.4pt;height:8.7pt;z-index:251654144;visibility:visible;mso-wrap-style:square;mso-width-percent:0;mso-height-percent:0;mso-wrap-distance-left:9pt;mso-wrap-distance-top:0;mso-wrap-distance-right:9pt;mso-wrap-distance-bottom:0;mso-position-horizontal:absolute;mso-position-horizontal-relative:text;mso-position-vertical:absolute;mso-position-vertical-relative:text;mso-width-percent:0;mso-height-percent:0;mso-width-relative:margin;mso-height-relative:margin;v-text-anchor:middle" o:gfxdata="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" filled="f" strokecolor="black [3213]" strokeweight="1pt"/>
                   </w:pict>
                 </mc:Fallback>
               </mc:AlternateContent>
@@ -1036,7 +1026,7 @@
                 </mc:Choice>
                 <mc:Fallback>
                   <w:pict>
-                    <v:rect w14:anchorId="463CC835" id="Rectangle 41" o:spid="_x0000_s1026" style="position:absolute;margin-left:.4pt;margin-top:.65pt;width:14.4pt;height:8.7pt;z-index:251655168;visibility:visible;mso-wrap-style:square;mso-width-percent:0;mso-height-percent:0;mso-wrap-distance-left:9pt;mso-wrap-distance-top:0;mso-wrap-distance-right:9pt;mso-wrap-distance-bottom:0;mso-position-horizontal:absolute;mso-position-horizontal-relative:text;mso-position-vertical:absolute;mso-position-vertical-relative:text;mso-width-percent:0;mso-height-percent:0;mso-width-relative:margin;mso-height-relative:margin;v-text-anchor:middle" o:gfxdata="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" filled="f" strokecolor="black [3213]" strokeweight="1pt"/>
+                    <v:rect w14:anchorId="4DC5426C" id="Rectangle 41" o:spid="_x0000_s1026" style="position:absolute;margin-left:.4pt;margin-top:.65pt;width:14.4pt;height:8.7pt;z-index:251655168;visibility:visible;mso-wrap-style:square;mso-width-percent:0;mso-height-percent:0;mso-wrap-distance-left:9pt;mso-wrap-distance-top:0;mso-wrap-distance-right:9pt;mso-wrap-distance-bottom:0;mso-position-horizontal:absolute;mso-position-horizontal-relative:text;mso-position-vertical:absolute;mso-position-vertical-relative:text;mso-width-percent:0;mso-height-percent:0;mso-width-relative:margin;mso-height-relative:margin;v-text-anchor:middle" o:gfxdata="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" filled="f" strokecolor="black [3213]" strokeweight="1pt"/>
                   </w:pict>
                 </mc:Fallback>
               </mc:AlternateContent>
@@ -1145,7 +1135,7 @@
                 </mc:Choice>
                 <mc:Fallback>
                   <w:pict>
-                    <v:rect w14:anchorId="642DC73D" id="Rectangle 42" o:spid="_x0000_s1026" style="position:absolute;margin-left:.25pt;margin-top:1pt;width:14.4pt;height:8.7pt;z-index:251656192;visibility:visible;mso-wrap-style:square;mso-width-percent:0;mso-height-percent:0;mso-wrap-distance-left:9pt;mso-wrap-distance-top:0;mso-wrap-distance-right:9pt;mso-wrap-distance-bottom:0;mso-position-horizontal:absolute;mso-position-horizontal-relative:text;mso-position-vertical:absolute;mso-position-vertical-relative:text;mso-width-percent:0;mso-height-percent:0;mso-width-relative:margin;mso-height-relative:margin;v-text-anchor:middle" o:gfxdata="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" filled="f" strokecolor="black [3213]" strokeweight="1pt"/>
+                    <v:rect w14:anchorId="15C94CFC" id="Rectangle 42" o:spid="_x0000_s1026" style="position:absolute;margin-left:.25pt;margin-top:1pt;width:14.4pt;height:8.7pt;z-index:251656192;visibility:visible;mso-wrap-style:square;mso-width-percent:0;mso-height-percent:0;mso-wrap-distance-left:9pt;mso-wrap-distance-top:0;mso-wrap-distance-right:9pt;mso-wrap-distance-bottom:0;mso-position-horizontal:absolute;mso-position-horizontal-relative:text;mso-position-vertical:absolute;mso-position-vertical-relative:text;mso-width-percent:0;mso-height-percent:0;mso-width-relative:margin;mso-height-relative:margin;v-text-anchor:middle" o:gfxdata="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" filled="f" strokecolor="black [3213]" strokeweight="1pt"/>
                   </w:pict>
                 </mc:Fallback>
               </mc:AlternateContent>
@@ -1254,7 +1244,7 @@
                 </mc:Choice>
                 <mc:Fallback>
                   <w:pict>
-                    <v:rect w14:anchorId="4DC26F0D" id="Rectangle 43" o:spid="_x0000_s1026" style="position:absolute;margin-left:0;margin-top:1.55pt;width:14.4pt;height:8.7pt;z-index:251657216;visibility:visible;mso-wrap-style:square;mso-width-percent:0;mso-height-percent:0;mso-wrap-distance-left:9pt;mso-wrap-distance-top:0;mso-wrap-distance-right:9pt;mso-wrap-distance-bottom:0;mso-position-horizontal:absolute;mso-position-horizontal-relative:text;mso-position-vertical:absolute;mso-position-vertical-relative:text;mso-width-percent:0;mso-height-percent:0;mso-width-relative:margin;mso-height-relative:margin;v-text-anchor:middle" o:gfxdata="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" filled="f" strokecolor="black [3213]" strokeweight="1pt"/>
+                    <v:rect w14:anchorId="63A5AF5A" id="Rectangle 43" o:spid="_x0000_s1026" style="position:absolute;margin-left:0;margin-top:1.55pt;width:14.4pt;height:8.7pt;z-index:251657216;visibility:visible;mso-wrap-style:square;mso-width-percent:0;mso-height-percent:0;mso-wrap-distance-left:9pt;mso-wrap-distance-top:0;mso-wrap-distance-right:9pt;mso-wrap-distance-bottom:0;mso-position-horizontal:absolute;mso-position-horizontal-relative:text;mso-position-vertical:absolute;mso-position-vertical-relative:text;mso-width-percent:0;mso-height-percent:0;mso-width-relative:margin;mso-height-relative:margin;v-text-anchor:middle" o:gfxdata="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" filled="f" strokecolor="black [3213]" strokeweight="1pt"/>
                   </w:pict>
                 </mc:Fallback>
               </mc:AlternateContent>
@@ -1363,7 +1353,7 @@
                 </mc:Choice>
                 <mc:Fallback>
                   <w:pict>
-                    <v:rect w14:anchorId="667EB2E2" id="Rectangle 3" o:spid="_x0000_s1026" style="position:absolute;margin-left:.2pt;margin-top:1.85pt;width:14.4pt;height:8.75pt;z-index:251661312;visibility:visible;mso-wrap-style:square;mso-width-percent:0;mso-height-percent:0;mso-wrap-distance-left:9pt;mso-wrap-distance-top:0;mso-wrap-distance-right:9pt;mso-wrap-distance-bottom:0;mso-position-horizontal:absolute;mso-position-horizontal-relative:text;mso-position-vertical:absolute;mso-position-vertical-relative:text;mso-width-percent:0;mso-height-percent:0;mso-width-relative:margin;mso-height-relative:margin;v-text-anchor:middle" o:gfxdata="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" filled="f" strokecolor="black [3213]" strokeweight="1pt"/>
+                    <v:rect w14:anchorId="3A14418A" id="Rectangle 3" o:spid="_x0000_s1026" style="position:absolute;margin-left:.2pt;margin-top:1.85pt;width:14.4pt;height:8.75pt;z-index:251661312;visibility:visible;mso-wrap-style:square;mso-width-percent:0;mso-height-percent:0;mso-wrap-distance-left:9pt;mso-wrap-distance-top:0;mso-wrap-distance-right:9pt;mso-wrap-distance-bottom:0;mso-position-horizontal:absolute;mso-position-horizontal-relative:text;mso-position-vertical:absolute;mso-position-vertical-relative:text;mso-width-percent:0;mso-height-percent:0;mso-width-relative:margin;mso-height-relative:margin;v-text-anchor:middle" o:gfxdata="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" filled="f" strokecolor="black [3213]" strokeweight="1pt"/>
                   </w:pict>
                 </mc:Fallback>
               </mc:AlternateContent>
@@ -1486,7 +1476,7 @@
                 </mc:Choice>
                 <mc:Fallback>
                   <w:pict>
-                    <v:rect w14:anchorId="6F1279A6" id="Rectangle 45" o:spid="_x0000_s1026" style="position:absolute;margin-left:0;margin-top:.95pt;width:14.4pt;height:8.7pt;z-index:251659264;visibility:visible;mso-wrap-style:square;mso-width-percent:0;mso-height-percent:0;mso-wrap-distance-left:9pt;mso-wrap-distance-top:0;mso-wrap-distance-right:9pt;mso-wrap-distance-bottom:0;mso-position-horizontal:absolute;mso-position-horizontal-relative:text;mso-position-vertical:absolute;mso-position-vertical-relative:text;mso-width-percent:0;mso-height-percent:0;mso-width-relative:margin;mso-height-relative:margin;v-text-anchor:middle" o:gfxdata="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" filled="f" strokecolor="black [3213]" strokeweight="1pt"/>
+                    <v:rect w14:anchorId="327D4857" id="Rectangle 45" o:spid="_x0000_s1026" style="position:absolute;margin-left:0;margin-top:.95pt;width:14.4pt;height:8.7pt;z-index:251659264;visibility:visible;mso-wrap-style:square;mso-width-percent:0;mso-height-percent:0;mso-wrap-distance-left:9pt;mso-wrap-distance-top:0;mso-wrap-distance-right:9pt;mso-wrap-distance-bottom:0;mso-position-horizontal:absolute;mso-position-horizontal-relative:text;mso-position-vertical:absolute;mso-position-vertical-relative:text;mso-width-percent:0;mso-height-percent:0;mso-width-relative:margin;mso-height-relative:margin;v-text-anchor:middle" o:gfxdata="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" filled="f" strokecolor="black [3213]" strokeweight="1pt"/>
                   </w:pict>
                 </mc:Fallback>
               </mc:AlternateContent>
@@ -1594,7 +1584,7 @@
                 </mc:Choice>
                 <mc:Fallback>
                   <w:pict>
-                    <v:rect w14:anchorId="53DF524C" id="Rectangle 19" o:spid="_x0000_s1026" style="position:absolute;margin-left:.2pt;margin-top:1.1pt;width:14.4pt;height:8.7pt;z-index:251645952;visibility:visible;mso-wrap-style:square;mso-width-percent:0;mso-height-percent:0;mso-wrap-distance-left:9pt;mso-wrap-distance-top:0;mso-wrap-distance-right:9pt;mso-wrap-distance-bottom:0;mso-position-horizontal:absolute;mso-position-horizontal-relative:text;mso-position-vertical:absolute;mso-position-vertical-relative:text;mso-width-percent:0;mso-height-percent:0;mso-width-relative:margin;mso-height-relative:margin;v-text-anchor:middle" o:gfxdata="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" filled="f" strokecolor="black [3213]" strokeweight="1pt"/>
+                    <v:rect w14:anchorId="5E542E4A" id="Rectangle 19" o:spid="_x0000_s1026" style="position:absolute;margin-left:.2pt;margin-top:1.1pt;width:14.4pt;height:8.7pt;z-index:251645952;visibility:visible;mso-wrap-style:square;mso-width-percent:0;mso-height-percent:0;mso-wrap-distance-left:9pt;mso-wrap-distance-top:0;mso-wrap-distance-right:9pt;mso-wrap-distance-bottom:0;mso-position-horizontal:absolute;mso-position-horizontal-relative:text;mso-position-vertical:absolute;mso-position-vertical-relative:text;mso-width-percent:0;mso-height-percent:0;mso-width-relative:margin;mso-height-relative:margin;v-text-anchor:middle" o:gfxdata="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" filled="f" strokecolor="black [3213]" strokeweight="1pt"/>
                   </w:pict>
                 </mc:Fallback>
               </mc:AlternateContent>
@@ -1695,7 +1685,7 @@
                 </mc:Choice>
                 <mc:Fallback>
                   <w:pict>
-                    <v:rect w14:anchorId="07E5E34D" id="Rectangle 21" o:spid="_x0000_s1026" style="position:absolute;margin-left:.15pt;margin-top:1.1pt;width:14.4pt;height:8.7pt;z-index:251646976;visibility:visible;mso-wrap-style:square;mso-width-percent:0;mso-height-percent:0;mso-wrap-distance-left:9pt;mso-wrap-distance-top:0;mso-wrap-distance-right:9pt;mso-wrap-distance-bottom:0;mso-position-horizontal:absolute;mso-position-horizontal-relative:text;mso-position-vertical:absolute;mso-position-vertical-relative:text;mso-width-percent:0;mso-height-percent:0;mso-width-relative:margin;mso-height-relative:margin;v-text-anchor:middle" o:gfxdata="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" filled="f" strokecolor="black [3213]" strokeweight="1pt"/>
+                    <v:rect w14:anchorId="6CD4C7A5" id="Rectangle 21" o:spid="_x0000_s1026" style="position:absolute;margin-left:.15pt;margin-top:1.1pt;width:14.4pt;height:8.7pt;z-index:251646976;visibility:visible;mso-wrap-style:square;mso-width-percent:0;mso-height-percent:0;mso-wrap-distance-left:9pt;mso-wrap-distance-top:0;mso-wrap-distance-right:9pt;mso-wrap-distance-bottom:0;mso-position-horizontal:absolute;mso-position-horizontal-relative:text;mso-position-vertical:absolute;mso-position-vertical-relative:text;mso-width-percent:0;mso-height-percent:0;mso-width-relative:margin;mso-height-relative:margin;v-text-anchor:middle" o:gfxdata="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" filled="f" strokecolor="black [3213]" strokeweight="1pt"/>
                   </w:pict>
                 </mc:Fallback>
               </mc:AlternateContent>
@@ -1796,7 +1786,7 @@
                 </mc:Choice>
                 <mc:Fallback>
                   <w:pict>
-                    <v:rect w14:anchorId="45563452" id="Rectangle 22" o:spid="_x0000_s1026" style="position:absolute;margin-left:.15pt;margin-top:1.35pt;width:14.4pt;height:8.7pt;z-index:251648000;visibility:visible;mso-wrap-style:square;mso-width-percent:0;mso-height-percent:0;mso-wrap-distance-left:9pt;mso-wrap-distance-top:0;mso-wrap-distance-right:9pt;mso-wrap-distance-bottom:0;mso-position-horizontal:absolute;mso-position-horizontal-relative:text;mso-position-vertical:absolute;mso-position-vertical-relative:text;mso-width-percent:0;mso-height-percent:0;mso-width-relative:margin;mso-height-relative:margin;v-text-anchor:middle" o:gfxdata="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" filled="f" strokecolor="black [3213]" strokeweight="1pt"/>
+                    <v:rect w14:anchorId="7AEECECF" id="Rectangle 22" o:spid="_x0000_s1026" style="position:absolute;margin-left:.15pt;margin-top:1.35pt;width:14.4pt;height:8.7pt;z-index:251648000;visibility:visible;mso-wrap-style:square;mso-width-percent:0;mso-height-percent:0;mso-wrap-distance-left:9pt;mso-wrap-distance-top:0;mso-wrap-distance-right:9pt;mso-wrap-distance-bottom:0;mso-position-horizontal:absolute;mso-position-horizontal-relative:text;mso-position-vertical:absolute;mso-position-vertical-relative:text;mso-width-percent:0;mso-height-percent:0;mso-width-relative:margin;mso-height-relative:margin;v-text-anchor:middle" o:gfxdata="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" filled="f" strokecolor="black [3213]" strokeweight="1pt"/>
                   </w:pict>
                 </mc:Fallback>
               </mc:AlternateContent>
@@ -1930,7 +1920,7 @@
                 </mc:Choice>
                 <mc:Fallback>
                   <w:pict>
-                    <v:rect w14:anchorId="3DC40260" id="Rectangle 23" o:spid="_x0000_s1026" style="position:absolute;margin-left:-.2pt;margin-top:1.5pt;width:14.4pt;height:8.7pt;z-index:251649024;visibility:visible;mso-wrap-style:square;mso-width-percent:0;mso-height-percent:0;mso-wrap-distance-left:9pt;mso-wrap-distance-top:0;mso-wrap-distance-right:9pt;mso-wrap-distance-bottom:0;mso-position-horizontal:absolute;mso-position-horizontal-relative:text;mso-position-vertical:absolute;mso-position-vertical-relative:text;mso-width-percent:0;mso-height-percent:0;mso-width-relative:margin;mso-height-relative:margin;v-text-anchor:middle" o:gfxdata="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" filled="f" strokecolor="black [3213]" strokeweight="1pt"/>
+                    <v:rect w14:anchorId="2771C332" id="Rectangle 23" o:spid="_x0000_s1026" style="position:absolute;margin-left:-.2pt;margin-top:1.5pt;width:14.4pt;height:8.7pt;z-index:251649024;visibility:visible;mso-wrap-style:square;mso-width-percent:0;mso-height-percent:0;mso-wrap-distance-left:9pt;mso-wrap-distance-top:0;mso-wrap-distance-right:9pt;mso-wrap-distance-bottom:0;mso-position-horizontal:absolute;mso-position-horizontal-relative:text;mso-position-vertical:absolute;mso-position-vertical-relative:text;mso-width-percent:0;mso-height-percent:0;mso-width-relative:margin;mso-height-relative:margin;v-text-anchor:middle" o:gfxdata="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" filled="f" strokecolor="black [3213]" strokeweight="1pt"/>
                   </w:pict>
                 </mc:Fallback>
               </mc:AlternateContent>
@@ -2031,7 +2021,7 @@
                 </mc:Choice>
                 <mc:Fallback>
                   <w:pict>
-                    <v:rect w14:anchorId="27215523" id="Rectangle 25" o:spid="_x0000_s1026" style="position:absolute;margin-left:-.2pt;margin-top:1.25pt;width:14.4pt;height:8.7pt;z-index:251650048;visibility:visible;mso-wrap-style:square;mso-width-percent:0;mso-height-percent:0;mso-wrap-distance-left:9pt;mso-wrap-distance-top:0;mso-wrap-distance-right:9pt;mso-wrap-distance-bottom:0;mso-position-horizontal:absolute;mso-position-horizontal-relative:text;mso-position-vertical:absolute;mso-position-vertical-relative:text;mso-width-percent:0;mso-height-percent:0;mso-width-relative:margin;mso-height-relative:margin;v-text-anchor:middle" o:gfxdata="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" filled="f" strokecolor="black [3213]" strokeweight="1pt"/>
+                    <v:rect w14:anchorId="253957ED" id="Rectangle 25" o:spid="_x0000_s1026" style="position:absolute;margin-left:-.2pt;margin-top:1.25pt;width:14.4pt;height:8.7pt;z-index:251650048;visibility:visible;mso-wrap-style:square;mso-width-percent:0;mso-height-percent:0;mso-wrap-distance-left:9pt;mso-wrap-distance-top:0;mso-wrap-distance-right:9pt;mso-wrap-distance-bottom:0;mso-position-horizontal:absolute;mso-position-horizontal-relative:text;mso-position-vertical:absolute;mso-position-vertical-relative:text;mso-width-percent:0;mso-height-percent:0;mso-width-relative:margin;mso-height-relative:margin;v-text-anchor:middle" o:gfxdata="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" filled="f" strokecolor="black [3213]" strokeweight="1pt"/>
                   </w:pict>
                 </mc:Fallback>
               </mc:AlternateContent>
@@ -2132,7 +2122,7 @@
                 </mc:Choice>
                 <mc:Fallback>
                   <w:pict>
-                    <v:rect w14:anchorId="2AACED0C" id="Rectangle 32" o:spid="_x0000_s1026" style="position:absolute;margin-left:-.4pt;margin-top:.9pt;width:14.4pt;height:8.7pt;z-index:251651072;visibility:visible;mso-wrap-style:square;mso-width-percent:0;mso-height-percent:0;mso-wrap-distance-left:9pt;mso-wrap-distance-top:0;mso-wrap-distance-right:9pt;mso-wrap-distance-bottom:0;mso-position-horizontal:absolute;mso-position-horizontal-relative:text;mso-position-vertical:absolute;mso-position-vertical-relative:text;mso-width-percent:0;mso-height-percent:0;mso-width-relative:margin;mso-height-relative:margin;v-text-anchor:middle" o:gfxdata="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" filled="f" strokecolor="black [3213]" strokeweight="1pt"/>
+                    <v:rect w14:anchorId="1DE1B414" id="Rectangle 32" o:spid="_x0000_s1026" style="position:absolute;margin-left:-.4pt;margin-top:.9pt;width:14.4pt;height:8.7pt;z-index:251651072;visibility:visible;mso-wrap-style:square;mso-width-percent:0;mso-height-percent:0;mso-wrap-distance-left:9pt;mso-wrap-distance-top:0;mso-wrap-distance-right:9pt;mso-wrap-distance-bottom:0;mso-position-horizontal:absolute;mso-position-horizontal-relative:text;mso-position-vertical:absolute;mso-position-vertical-relative:text;mso-width-percent:0;mso-height-percent:0;mso-width-relative:margin;mso-height-relative:margin;v-text-anchor:middle" o:gfxdata="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" filled="f" strokecolor="black [3213]" strokeweight="1pt"/>
                   </w:pict>
                 </mc:Fallback>
               </mc:AlternateContent>
@@ -2231,7 +2221,7 @@
                 </mc:Choice>
                 <mc:Fallback>
                   <w:pict>
-                    <v:rect w14:anchorId="76362220" id="Rectangle 37" o:spid="_x0000_s1026" style="position:absolute;margin-left:-.6pt;margin-top:.4pt;width:14.4pt;height:8.7pt;z-index:251652096;visibility:visible;mso-wrap-style:square;mso-width-percent:0;mso-height-percent:0;mso-wrap-distance-left:9pt;mso-wrap-distance-top:0;mso-wrap-distance-right:9pt;mso-wrap-distance-bottom:0;mso-position-horizontal:absolute;mso-position-horizontal-relative:text;mso-position-vertical:absolute;mso-position-vertical-relative:text;mso-width-percent:0;mso-height-percent:0;mso-width-relative:margin;mso-height-relative:margin;v-text-anchor:middle" o:gfxdata="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" filled="f" strokecolor="black [3213]" strokeweight="1pt"/>
+                    <v:rect w14:anchorId="7D95EAF2" id="Rectangle 37" o:spid="_x0000_s1026" style="position:absolute;margin-left:-.6pt;margin-top:.4pt;width:14.4pt;height:8.7pt;z-index:251652096;visibility:visible;mso-wrap-style:square;mso-width-percent:0;mso-height-percent:0;mso-wrap-distance-left:9pt;mso-wrap-distance-top:0;mso-wrap-distance-right:9pt;mso-wrap-distance-bottom:0;mso-position-horizontal:absolute;mso-position-horizontal-relative:text;mso-position-vertical:absolute;mso-position-vertical-relative:text;mso-width-percent:0;mso-height-percent:0;mso-width-relative:margin;mso-height-relative:margin;v-text-anchor:middle" o:gfxdata="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" filled="f" strokecolor="black [3213]" strokeweight="1pt"/>
                   </w:pict>
                 </mc:Fallback>
               </mc:AlternateContent>
@@ -2338,7 +2328,7 @@
                 </mc:Choice>
                 <mc:Fallback>
                   <w:pict>
-                    <v:rect w14:anchorId="3BCF4CFB" id="Rectangle 2" o:spid="_x0000_s1026" style="position:absolute;margin-left:-2.35pt;margin-top:1.6pt;width:16.35pt;height:8.7pt;z-index:251642880;visibility:visible;mso-wrap-style:square;mso-width-percent:0;mso-height-percent:0;mso-wrap-distance-left:9pt;mso-wrap-distance-top:0;mso-wrap-distance-right:9pt;mso-wrap-distance-bottom:0;mso-position-horizontal:absolute;mso-position-horizontal-relative:text;mso-position-vertical:absolute;mso-position-vertical-relative:text;mso-width-percent:0;mso-height-percent:0;mso-width-relative:margin;mso-height-relative:margin;v-text-anchor:middle" o:gfxdata="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" filled="f" strokecolor="black [3213]" strokeweight="1pt"/>
+                    <v:rect w14:anchorId="15F6250A" id="Rectangle 2" o:spid="_x0000_s1026" style="position:absolute;margin-left:-2.35pt;margin-top:1.6pt;width:16.35pt;height:8.7pt;z-index:251642880;visibility:visible;mso-wrap-style:square;mso-width-percent:0;mso-height-percent:0;mso-wrap-distance-left:9pt;mso-wrap-distance-top:0;mso-wrap-distance-right:9pt;mso-wrap-distance-bottom:0;mso-position-horizontal:absolute;mso-position-horizontal-relative:text;mso-position-vertical:absolute;mso-position-vertical-relative:text;mso-width-percent:0;mso-height-percent:0;mso-width-relative:margin;mso-height-relative:margin;v-text-anchor:middle" o:gfxdata="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" filled="f" strokecolor="black [3213]" strokeweight="1pt"/>
                   </w:pict>
                 </mc:Fallback>
               </mc:AlternateContent>
@@ -2455,7 +2445,7 @@
                 </mc:Choice>
                 <mc:Fallback>
                   <w:pict>
-                    <v:rect w14:anchorId="791BAB9D" id="Rectangle 7" o:spid="_x0000_s1026" style="position:absolute;margin-left:-2.35pt;margin-top:1.65pt;width:16.35pt;height:8.7pt;z-index:251643904;visibility:visible;mso-wrap-style:square;mso-width-percent:0;mso-height-percent:0;mso-wrap-distance-left:9pt;mso-wrap-distance-top:0;mso-wrap-distance-right:9pt;mso-wrap-distance-bottom:0;mso-position-horizontal:absolute;mso-position-horizontal-relative:text;mso-position-vertical:absolute;mso-position-vertical-relative:text;mso-width-percent:0;mso-height-percent:0;mso-width-relative:margin;mso-height-relative:margin;v-text-anchor:middle" o:gfxdata="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" filled="f" strokecolor="black [3213]" strokeweight="1pt"/>
+                    <v:rect w14:anchorId="11DE977D" id="Rectangle 7" o:spid="_x0000_s1026" style="position:absolute;margin-left:-2.35pt;margin-top:1.65pt;width:16.35pt;height:8.7pt;z-index:251643904;visibility:visible;mso-wrap-style:square;mso-width-percent:0;mso-height-percent:0;mso-wrap-distance-left:9pt;mso-wrap-distance-top:0;mso-wrap-distance-right:9pt;mso-wrap-distance-bottom:0;mso-position-horizontal:absolute;mso-position-horizontal-relative:text;mso-position-vertical:absolute;mso-position-vertical-relative:text;mso-width-percent:0;mso-height-percent:0;mso-width-relative:margin;mso-height-relative:margin;v-text-anchor:middle" o:gfxdata="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" filled="f" strokecolor="black [3213]" strokeweight="1pt"/>
                   </w:pict>
                 </mc:Fallback>
               </mc:AlternateContent>
@@ -2605,7 +2595,7 @@
                 </mc:Choice>
                 <mc:Fallback>
                   <w:pict>
-                    <v:rect w14:anchorId="0DA5CD1B" id="Rectangle 9" o:spid="_x0000_s1026" style="position:absolute;margin-left:-2.6pt;margin-top:1.75pt;width:16.35pt;height:8.7pt;z-index:251644928;visibility:visible;mso-wrap-style:square;mso-width-percent:0;mso-height-percent:0;mso-wrap-distance-left:9pt;mso-wrap-distance-top:0;mso-wrap-distance-right:9pt;mso-wrap-distance-bottom:0;mso-position-horizontal:absolute;mso-position-horizontal-relative:text;mso-position-vertical:absolute;mso-position-vertical-relative:text;mso-width-percent:0;mso-height-percent:0;mso-width-relative:margin;mso-height-relative:margin;v-text-anchor:middle" o:gfxdata="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" filled="f" strokecolor="black [3213]" strokeweight="1pt"/>
+                    <v:rect w14:anchorId="5AC7DEAF" id="Rectangle 9" o:spid="_x0000_s1026" style="position:absolute;margin-left:-2.6pt;margin-top:1.75pt;width:16.35pt;height:8.7pt;z-index:251644928;visibility:visible;mso-wrap-style:square;mso-width-percent:0;mso-height-percent:0;mso-wrap-distance-left:9pt;mso-wrap-distance-top:0;mso-wrap-distance-right:9pt;mso-wrap-distance-bottom:0;mso-position-horizontal:absolute;mso-position-horizontal-relative:text;mso-position-vertical:absolute;mso-position-vertical-relative:text;mso-width-percent:0;mso-height-percent:0;mso-width-relative:margin;mso-height-relative:margin;v-text-anchor:middle" o:gfxdata="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" filled="f" strokecolor="black [3213]" strokeweight="1pt"/>
                   </w:pict>
                 </mc:Fallback>
               </mc:AlternateContent>
@@ -2730,7 +2720,7 @@
                 </mc:Choice>
                 <mc:Fallback>
                   <w:pict>
-                    <v:rect w14:anchorId="7500713B" id="Rectangle 1" o:spid="_x0000_s1026" style="position:absolute;margin-left:-2.6pt;margin-top:11.8pt;width:16.35pt;height:8.7pt;z-index:251660288;visibility:visible;mso-wrap-style:square;mso-width-percent:0;mso-height-percent:0;mso-wrap-distance-left:9pt;mso-wrap-distance-top:0;mso-wrap-distance-right:9pt;mso-wrap-distance-bottom:0;mso-position-horizontal:absolute;mso-position-horizontal-relative:text;mso-position-vertical:absolute;mso-position-vertical-relative:text;mso-width-percent:0;mso-height-percent:0;mso-width-relative:margin;mso-height-relative:margin;v-text-anchor:middle" o:gfxdata="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" filled="f" strokecolor="black [3213]" strokeweight="1pt"/>
+                    <v:rect w14:anchorId="5481A721" id="Rectangle 1" o:spid="_x0000_s1026" style="position:absolute;margin-left:-2.6pt;margin-top:11.8pt;width:16.35pt;height:8.7pt;z-index:251660288;visibility:visible;mso-wrap-style:square;mso-width-percent:0;mso-height-percent:0;mso-wrap-distance-left:9pt;mso-wrap-distance-top:0;mso-wrap-distance-right:9pt;mso-wrap-distance-bottom:0;mso-position-horizontal:absolute;mso-position-horizontal-relative:text;mso-position-vertical:absolute;mso-position-vertical-relative:text;mso-width-percent:0;mso-height-percent:0;mso-width-relative:margin;mso-height-relative:margin;v-text-anchor:middle" o:gfxdata="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" filled="f" strokecolor="black [3213]" strokeweight="1pt"/>
                   </w:pict>
                 </mc:Fallback>
               </mc:AlternateContent>
@@ -2863,7 +2853,7 @@
                 </mc:Choice>
                 <mc:Fallback>
                   <w:pict>
-                    <v:rect w14:anchorId="6056D44C" id="Rectangle 44" o:spid="_x0000_s1026" style="position:absolute;margin-left:-2.5pt;margin-top:12.15pt;width:16.35pt;height:8.7pt;z-index:251658240;visibility:visible;mso-wrap-style:square;mso-width-percent:0;mso-height-percent:0;mso-wrap-distance-left:9pt;mso-wrap-distance-top:0;mso-wrap-distance-right:9pt;mso-wrap-distance-bottom:0;mso-position-horizontal:absolute;mso-position-horizontal-relative:text;mso-position-vertical:absolute;mso-position-vertical-relative:text;mso-width-percent:0;mso-height-percent:0;mso-width-relative:margin;mso-height-relative:margin;v-text-anchor:middle" o:gfxdata="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" filled="f" strokecolor="black [3213]" strokeweight="1pt"/>
+                    <v:rect w14:anchorId="23BAFF3B" id="Rectangle 44" o:spid="_x0000_s1026" style="position:absolute;margin-left:-2.5pt;margin-top:12.15pt;width:16.35pt;height:8.7pt;z-index:251658240;visibility:visible;mso-wrap-style:square;mso-width-percent:0;mso-height-percent:0;mso-wrap-distance-left:9pt;mso-wrap-distance-top:0;mso-wrap-distance-right:9pt;mso-wrap-distance-bottom:0;mso-position-horizontal:absolute;mso-position-horizontal-relative:text;mso-position-vertical:absolute;mso-position-vertical-relative:text;mso-width-percent:0;mso-height-percent:0;mso-width-relative:margin;mso-height-relative:margin;v-text-anchor:middle" o:gfxdata="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" filled="f" strokecolor="black [3213]" strokeweight="1pt"/>
                   </w:pict>
                 </mc:Fallback>
               </mc:AlternateContent>
@@ -3035,25 +3025,7 @@
                 <w:sz w:val="20"/>
                 <w:szCs w:val="20"/>
               </w:rPr>
-              <w:t>{</w:t>
-            </w:r>
-            <w:proofErr w:type="spellStart"/>
-            <w:r>
-              <w:rPr>
-                <w:rFonts w:ascii="Arial Narrow" w:hAnsi="Arial Narrow"/>
-                <w:sz w:val="20"/>
-                <w:szCs w:val="20"/>
-              </w:rPr>
-              <w:t>Date_started</w:t>
-            </w:r>
-            <w:proofErr w:type="spellEnd"/>
-            <w:r>
-              <w:rPr>
-                <w:rFonts w:ascii="Arial Narrow" w:hAnsi="Arial Narrow"/>
-                <w:sz w:val="20"/>
-                <w:szCs w:val="20"/>
-              </w:rPr>
-              <w:t>}</w:t>
+              <w:t>{Date_started}</w:t>
             </w:r>
           </w:p>
         </w:tc>
@@ -3906,7 +3878,7 @@
                 </mc:Choice>
                 <mc:Fallback>
                   <w:pict>
-                    <v:rect w14:anchorId="10055E38" id="Rectangle 5" o:spid="_x0000_s1026" style="position:absolute;margin-left:.2pt;margin-top:.85pt;width:16.35pt;height:8.7pt;z-index:251662336;visibility:visible;mso-wrap-style:square;mso-width-percent:0;mso-height-percent:0;mso-wrap-distance-left:9pt;mso-wrap-distance-top:0;mso-wrap-distance-right:9pt;mso-wrap-distance-bottom:0;mso-position-horizontal:absolute;mso-position-horizontal-relative:text;mso-position-vertical:absolute;mso-position-vertical-relative:text;mso-width-percent:0;mso-height-percent:0;mso-width-relative:margin;mso-height-relative:margin;v-text-anchor:middle" o:gfxdata="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" filled="f" strokecolor="black [3213]" strokeweight="1pt"/>
+                    <v:rect w14:anchorId="050BDACD" id="Rectangle 5" o:spid="_x0000_s1026" style="position:absolute;margin-left:.2pt;margin-top:.85pt;width:16.35pt;height:8.7pt;z-index:251662336;visibility:visible;mso-wrap-style:square;mso-width-percent:0;mso-height-percent:0;mso-wrap-distance-left:9pt;mso-wrap-distance-top:0;mso-wrap-distance-right:9pt;mso-wrap-distance-bottom:0;mso-position-horizontal:absolute;mso-position-horizontal-relative:text;mso-position-vertical:absolute;mso-position-vertical-relative:text;mso-width-percent:0;mso-height-percent:0;mso-width-relative:margin;mso-height-relative:margin;v-text-anchor:middle" o:gfxdata="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" filled="f" strokecolor="black [3213]" strokeweight="1pt"/>
                   </w:pict>
                 </mc:Fallback>
               </mc:AlternateContent>
@@ -3990,7 +3962,7 @@
                 </mc:Choice>
                 <mc:Fallback>
                   <w:pict>
-                    <v:rect w14:anchorId="6C7F49C3" id="Rectangle 6" o:spid="_x0000_s1026" style="position:absolute;margin-left:-.05pt;margin-top:17.25pt;width:16.35pt;height:8.7pt;z-index:251663360;visibility:visible;mso-wrap-style:square;mso-width-percent:0;mso-height-percent:0;mso-wrap-distance-left:9pt;mso-wrap-distance-top:0;mso-wrap-distance-right:9pt;mso-wrap-distance-bottom:0;mso-position-horizontal:absolute;mso-position-horizontal-relative:text;mso-position-vertical:absolute;mso-position-vertical-relative:text;mso-width-percent:0;mso-height-percent:0;mso-width-relative:margin;mso-height-relative:margin;v-text-anchor:middle" o:gfxdata="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" filled="f" strokecolor="black [3213]" strokeweight="1pt"/>
+                    <v:rect w14:anchorId="7B2345CE" id="Rectangle 6" o:spid="_x0000_s1026" style="position:absolute;margin-left:-.05pt;margin-top:17.25pt;width:16.35pt;height:8.7pt;z-index:251663360;visibility:visible;mso-wrap-style:square;mso-width-percent:0;mso-height-percent:0;mso-wrap-distance-left:9pt;mso-wrap-distance-top:0;mso-wrap-distance-right:9pt;mso-wrap-distance-bottom:0;mso-position-horizontal:absolute;mso-position-horizontal-relative:text;mso-position-vertical:absolute;mso-position-vertical-relative:text;mso-width-percent:0;mso-height-percent:0;mso-width-relative:margin;mso-height-relative:margin;v-text-anchor:middle" o:gfxdata="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" filled="f" strokecolor="black [3213]" strokeweight="1pt"/>
                   </w:pict>
                 </mc:Fallback>
               </mc:AlternateContent>
@@ -4091,27 +4063,7 @@
                 <w:sz w:val="26"/>
                 <w:szCs w:val="26"/>
               </w:rPr>
-              <w:t>{</w:t>
-            </w:r>
-            <w:proofErr w:type="spellStart"/>
-            <w:r>
-              <w:rPr>
-                <w:rFonts w:ascii="Arial Narrow" w:hAnsi="Arial Narrow"/>
-                <w:color w:val="000000" w:themeColor="text1"/>
-                <w:sz w:val="26"/>
-                <w:szCs w:val="26"/>
-              </w:rPr>
-              <w:t>Job_particulars</w:t>
-            </w:r>
-            <w:proofErr w:type="spellEnd"/>
-            <w:r>
-              <w:rPr>
-                <w:rFonts w:ascii="Arial Narrow" w:hAnsi="Arial Narrow"/>
-                <w:color w:val="000000" w:themeColor="text1"/>
-                <w:sz w:val="26"/>
-                <w:szCs w:val="26"/>
-              </w:rPr>
-              <w:t>}</w:t>
+              <w:t>{Job_particulars}</w:t>
             </w:r>
           </w:p>
           <w:p>
@@ -4232,6 +4184,30 @@
                 <w:szCs w:val="20"/>
               </w:rPr>
             </w:pPr>
+            <w:r>
+              <w:rPr>
+                <w:rFonts w:ascii="Arial Narrow" w:hAnsi="Arial Narrow"/>
+                <w:sz w:val="20"/>
+                <w:szCs w:val="20"/>
+              </w:rPr>
+              <w:t>{Personnel_</w:t>
+            </w:r>
+            <w:r>
+              <w:rPr>
+                <w:rFonts w:ascii="Arial Narrow" w:hAnsi="Arial Narrow"/>
+                <w:sz w:val="20"/>
+                <w:szCs w:val="20"/>
+              </w:rPr>
+              <w:t>6</w:t>
+            </w:r>
+            <w:r>
+              <w:rPr>
+                <w:rFonts w:ascii="Arial Narrow" w:hAnsi="Arial Narrow"/>
+                <w:sz w:val="20"/>
+                <w:szCs w:val="20"/>
+              </w:rPr>
+              <w:t>}</w:t>
+            </w:r>
           </w:p>
         </w:tc>
       </w:tr>
@@ -4281,6 +4257,30 @@
                 <w:szCs w:val="20"/>
               </w:rPr>
             </w:pPr>
+            <w:r>
+              <w:rPr>
+                <w:rFonts w:ascii="Arial Narrow" w:hAnsi="Arial Narrow"/>
+                <w:sz w:val="20"/>
+                <w:szCs w:val="20"/>
+              </w:rPr>
+              <w:t>{Personnel_</w:t>
+            </w:r>
+            <w:r>
+              <w:rPr>
+                <w:rFonts w:ascii="Arial Narrow" w:hAnsi="Arial Narrow"/>
+                <w:sz w:val="20"/>
+                <w:szCs w:val="20"/>
+              </w:rPr>
+              <w:t>7</w:t>
+            </w:r>
+            <w:r>
+              <w:rPr>
+                <w:rFonts w:ascii="Arial Narrow" w:hAnsi="Arial Narrow"/>
+                <w:sz w:val="20"/>
+                <w:szCs w:val="20"/>
+              </w:rPr>
+              <w:t>}</w:t>
+            </w:r>
           </w:p>
         </w:tc>
       </w:tr>
@@ -4330,6 +4330,30 @@
                 <w:szCs w:val="20"/>
               </w:rPr>
             </w:pPr>
+            <w:r>
+              <w:rPr>
+                <w:rFonts w:ascii="Arial Narrow" w:hAnsi="Arial Narrow"/>
+                <w:sz w:val="20"/>
+                <w:szCs w:val="20"/>
+              </w:rPr>
+              <w:t>{Personnel_</w:t>
+            </w:r>
+            <w:r>
+              <w:rPr>
+                <w:rFonts w:ascii="Arial Narrow" w:hAnsi="Arial Narrow"/>
+                <w:sz w:val="20"/>
+                <w:szCs w:val="20"/>
+              </w:rPr>
+              <w:t>8</w:t>
+            </w:r>
+            <w:r>
+              <w:rPr>
+                <w:rFonts w:ascii="Arial Narrow" w:hAnsi="Arial Narrow"/>
+                <w:sz w:val="20"/>
+                <w:szCs w:val="20"/>
+              </w:rPr>
+              <w:t>}</w:t>
+            </w:r>
           </w:p>
         </w:tc>
       </w:tr>
@@ -4379,6 +4403,30 @@
                 <w:szCs w:val="20"/>
               </w:rPr>
             </w:pPr>
+            <w:r>
+              <w:rPr>
+                <w:rFonts w:ascii="Arial Narrow" w:hAnsi="Arial Narrow"/>
+                <w:sz w:val="20"/>
+                <w:szCs w:val="20"/>
+              </w:rPr>
+              <w:t>{Personnel_</w:t>
+            </w:r>
+            <w:r>
+              <w:rPr>
+                <w:rFonts w:ascii="Arial Narrow" w:hAnsi="Arial Narrow"/>
+                <w:sz w:val="20"/>
+                <w:szCs w:val="20"/>
+              </w:rPr>
+              <w:t>9</w:t>
+            </w:r>
+            <w:r>
+              <w:rPr>
+                <w:rFonts w:ascii="Arial Narrow" w:hAnsi="Arial Narrow"/>
+                <w:sz w:val="20"/>
+                <w:szCs w:val="20"/>
+              </w:rPr>
+              <w:t>}</w:t>
+            </w:r>
           </w:p>
         </w:tc>
       </w:tr>
@@ -4402,6 +4450,30 @@
                 <w:szCs w:val="20"/>
               </w:rPr>
             </w:pPr>
+            <w:r>
+              <w:rPr>
+                <w:rFonts w:ascii="Arial Narrow" w:hAnsi="Arial Narrow"/>
+                <w:sz w:val="20"/>
+                <w:szCs w:val="20"/>
+              </w:rPr>
+              <w:t>{Personnel_</w:t>
+            </w:r>
+            <w:r>
+              <w:rPr>
+                <w:rFonts w:ascii="Arial Narrow" w:hAnsi="Arial Narrow"/>
+                <w:sz w:val="20"/>
+                <w:szCs w:val="20"/>
+              </w:rPr>
+              <w:t>5</w:t>
+            </w:r>
+            <w:r>
+              <w:rPr>
+                <w:rFonts w:ascii="Arial Narrow" w:hAnsi="Arial Narrow"/>
+                <w:sz w:val="20"/>
+                <w:szCs w:val="20"/>
+              </w:rPr>
+              <w:t>}</w:t>
+            </w:r>
           </w:p>
         </w:tc>
         <w:tc>
@@ -4420,6 +4492,30 @@
                 <w:szCs w:val="20"/>
               </w:rPr>
             </w:pPr>
+            <w:r>
+              <w:rPr>
+                <w:rFonts w:ascii="Arial Narrow" w:hAnsi="Arial Narrow"/>
+                <w:sz w:val="20"/>
+                <w:szCs w:val="20"/>
+              </w:rPr>
+              <w:t>{Personnel_</w:t>
+            </w:r>
+            <w:r>
+              <w:rPr>
+                <w:rFonts w:ascii="Arial Narrow" w:hAnsi="Arial Narrow"/>
+                <w:sz w:val="20"/>
+                <w:szCs w:val="20"/>
+              </w:rPr>
+              <w:t>10</w:t>
+            </w:r>
+            <w:r>
+              <w:rPr>
+                <w:rFonts w:ascii="Arial Narrow" w:hAnsi="Arial Narrow"/>
+                <w:sz w:val="20"/>
+                <w:szCs w:val="20"/>
+              </w:rPr>
+              <w:t>}</w:t>
+            </w:r>
           </w:p>
         </w:tc>
       </w:tr>

</xml_diff>

<commit_message>
feat(document): implement dynamic approved by and issued by placeholders and signature injection
</commit_message>
<xml_diff>
--- a/public/templates/FGMU Job Request Form.docx
+++ b/public/templates/FGMU Job Request Form.docx
@@ -444,7 +444,25 @@
                 <w:sz w:val="18"/>
                 <w:szCs w:val="18"/>
               </w:rPr>
-              <w:t xml:space="preserve"> {contact_no}</w:t>
+              <w:t xml:space="preserve"> {</w:t>
+            </w:r>
+            <w:proofErr w:type="spellStart"/>
+            <w:r>
+              <w:rPr>
+                <w:rFonts w:ascii="Arial Narrow" w:hAnsi="Arial Narrow"/>
+                <w:sz w:val="18"/>
+                <w:szCs w:val="18"/>
+              </w:rPr>
+              <w:t>contact_no</w:t>
+            </w:r>
+            <w:proofErr w:type="spellEnd"/>
+            <w:r>
+              <w:rPr>
+                <w:rFonts w:ascii="Arial Narrow" w:hAnsi="Arial Narrow"/>
+                <w:sz w:val="18"/>
+                <w:szCs w:val="18"/>
+              </w:rPr>
+              <w:t>}</w:t>
             </w:r>
           </w:p>
         </w:tc>
@@ -700,7 +718,25 @@
                 <w:sz w:val="20"/>
                 <w:szCs w:val="20"/>
               </w:rPr>
-              <w:t>{Working_days}</w:t>
+              <w:t>{</w:t>
+            </w:r>
+            <w:proofErr w:type="spellStart"/>
+            <w:r>
+              <w:rPr>
+                <w:rFonts w:ascii="Arial Narrow" w:hAnsi="Arial Narrow"/>
+                <w:sz w:val="20"/>
+                <w:szCs w:val="20"/>
+              </w:rPr>
+              <w:t>Working_days</w:t>
+            </w:r>
+            <w:proofErr w:type="spellEnd"/>
+            <w:r>
+              <w:rPr>
+                <w:rFonts w:ascii="Arial Narrow" w:hAnsi="Arial Narrow"/>
+                <w:sz w:val="20"/>
+                <w:szCs w:val="20"/>
+              </w:rPr>
+              <w:t>}</w:t>
             </w:r>
           </w:p>
         </w:tc>
@@ -802,7 +838,7 @@
                 </mc:Choice>
                 <mc:Fallback>
                   <w:pict>
-                    <v:rect w14:anchorId="23CD97A0" id="Rectangle 38" o:spid="_x0000_s1026" style="position:absolute;margin-left:.5pt;margin-top:1.6pt;width:14.4pt;height:8.7pt;z-index:251653120;visibility:visible;mso-wrap-style:square;mso-width-percent:0;mso-height-percent:0;mso-wrap-distance-left:9pt;mso-wrap-distance-top:0;mso-wrap-distance-right:9pt;mso-wrap-distance-bottom:0;mso-position-horizontal:absolute;mso-position-horizontal-relative:text;mso-position-vertical:absolute;mso-position-vertical-relative:text;mso-width-percent:0;mso-height-percent:0;mso-width-relative:margin;mso-height-relative:margin;v-text-anchor:middle" o:gfxdata="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" filled="f" strokecolor="black [3213]" strokeweight="1pt"/>
+                    <v:rect w14:anchorId="02C1C1D4" id="Rectangle 38" o:spid="_x0000_s1026" style="position:absolute;margin-left:.5pt;margin-top:1.6pt;width:14.4pt;height:8.7pt;z-index:251653120;visibility:visible;mso-wrap-style:square;mso-width-percent:0;mso-height-percent:0;mso-wrap-distance-left:9pt;mso-wrap-distance-top:0;mso-wrap-distance-right:9pt;mso-wrap-distance-bottom:0;mso-position-horizontal:absolute;mso-position-horizontal-relative:text;mso-position-vertical:absolute;mso-position-vertical-relative:text;mso-width-percent:0;mso-height-percent:0;mso-width-relative:margin;mso-height-relative:margin;v-text-anchor:middle" o:gfxdata="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" filled="f" strokecolor="black [3213]" strokeweight="1pt"/>
                   </w:pict>
                 </mc:Fallback>
               </mc:AlternateContent>
@@ -909,7 +945,7 @@
                 </mc:Choice>
                 <mc:Fallback>
                   <w:pict>
-                    <v:rect w14:anchorId="64DAB372" id="Rectangle 40" o:spid="_x0000_s1026" style="position:absolute;margin-left:.4pt;margin-top:1.1pt;width:14.4pt;height:8.7pt;z-index:251654144;visibility:visible;mso-wrap-style:square;mso-width-percent:0;mso-height-percent:0;mso-wrap-distance-left:9pt;mso-wrap-distance-top:0;mso-wrap-distance-right:9pt;mso-wrap-distance-bottom:0;mso-position-horizontal:absolute;mso-position-horizontal-relative:text;mso-position-vertical:absolute;mso-position-vertical-relative:text;mso-width-percent:0;mso-height-percent:0;mso-width-relative:margin;mso-height-relative:margin;v-text-anchor:middle" o:gfxdata="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" filled="f" strokecolor="black [3213]" strokeweight="1pt"/>
+                    <v:rect w14:anchorId="52C6A28F" id="Rectangle 40" o:spid="_x0000_s1026" style="position:absolute;margin-left:.4pt;margin-top:1.1pt;width:14.4pt;height:8.7pt;z-index:251654144;visibility:visible;mso-wrap-style:square;mso-width-percent:0;mso-height-percent:0;mso-wrap-distance-left:9pt;mso-wrap-distance-top:0;mso-wrap-distance-right:9pt;mso-wrap-distance-bottom:0;mso-position-horizontal:absolute;mso-position-horizontal-relative:text;mso-position-vertical:absolute;mso-position-vertical-relative:text;mso-width-percent:0;mso-height-percent:0;mso-width-relative:margin;mso-height-relative:margin;v-text-anchor:middle" o:gfxdata="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" filled="f" strokecolor="black [3213]" strokeweight="1pt"/>
                   </w:pict>
                 </mc:Fallback>
               </mc:AlternateContent>
@@ -1026,7 +1062,7 @@
                 </mc:Choice>
                 <mc:Fallback>
                   <w:pict>
-                    <v:rect w14:anchorId="4DC5426C" id="Rectangle 41" o:spid="_x0000_s1026" style="position:absolute;margin-left:.4pt;margin-top:.65pt;width:14.4pt;height:8.7pt;z-index:251655168;visibility:visible;mso-wrap-style:square;mso-width-percent:0;mso-height-percent:0;mso-wrap-distance-left:9pt;mso-wrap-distance-top:0;mso-wrap-distance-right:9pt;mso-wrap-distance-bottom:0;mso-position-horizontal:absolute;mso-position-horizontal-relative:text;mso-position-vertical:absolute;mso-position-vertical-relative:text;mso-width-percent:0;mso-height-percent:0;mso-width-relative:margin;mso-height-relative:margin;v-text-anchor:middle" o:gfxdata="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" filled="f" strokecolor="black [3213]" strokeweight="1pt"/>
+                    <v:rect w14:anchorId="2EA0405C" id="Rectangle 41" o:spid="_x0000_s1026" style="position:absolute;margin-left:.4pt;margin-top:.65pt;width:14.4pt;height:8.7pt;z-index:251655168;visibility:visible;mso-wrap-style:square;mso-width-percent:0;mso-height-percent:0;mso-wrap-distance-left:9pt;mso-wrap-distance-top:0;mso-wrap-distance-right:9pt;mso-wrap-distance-bottom:0;mso-position-horizontal:absolute;mso-position-horizontal-relative:text;mso-position-vertical:absolute;mso-position-vertical-relative:text;mso-width-percent:0;mso-height-percent:0;mso-width-relative:margin;mso-height-relative:margin;v-text-anchor:middle" o:gfxdata="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" filled="f" strokecolor="black [3213]" strokeweight="1pt"/>
                   </w:pict>
                 </mc:Fallback>
               </mc:AlternateContent>
@@ -1135,7 +1171,7 @@
                 </mc:Choice>
                 <mc:Fallback>
                   <w:pict>
-                    <v:rect w14:anchorId="15C94CFC" id="Rectangle 42" o:spid="_x0000_s1026" style="position:absolute;margin-left:.25pt;margin-top:1pt;width:14.4pt;height:8.7pt;z-index:251656192;visibility:visible;mso-wrap-style:square;mso-width-percent:0;mso-height-percent:0;mso-wrap-distance-left:9pt;mso-wrap-distance-top:0;mso-wrap-distance-right:9pt;mso-wrap-distance-bottom:0;mso-position-horizontal:absolute;mso-position-horizontal-relative:text;mso-position-vertical:absolute;mso-position-vertical-relative:text;mso-width-percent:0;mso-height-percent:0;mso-width-relative:margin;mso-height-relative:margin;v-text-anchor:middle" o:gfxdata="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" filled="f" strokecolor="black [3213]" strokeweight="1pt"/>
+                    <v:rect w14:anchorId="13C899A0" id="Rectangle 42" o:spid="_x0000_s1026" style="position:absolute;margin-left:.25pt;margin-top:1pt;width:14.4pt;height:8.7pt;z-index:251656192;visibility:visible;mso-wrap-style:square;mso-width-percent:0;mso-height-percent:0;mso-wrap-distance-left:9pt;mso-wrap-distance-top:0;mso-wrap-distance-right:9pt;mso-wrap-distance-bottom:0;mso-position-horizontal:absolute;mso-position-horizontal-relative:text;mso-position-vertical:absolute;mso-position-vertical-relative:text;mso-width-percent:0;mso-height-percent:0;mso-width-relative:margin;mso-height-relative:margin;v-text-anchor:middle" o:gfxdata="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" filled="f" strokecolor="black [3213]" strokeweight="1pt"/>
                   </w:pict>
                 </mc:Fallback>
               </mc:AlternateContent>
@@ -1244,7 +1280,7 @@
                 </mc:Choice>
                 <mc:Fallback>
                   <w:pict>
-                    <v:rect w14:anchorId="63A5AF5A" id="Rectangle 43" o:spid="_x0000_s1026" style="position:absolute;margin-left:0;margin-top:1.55pt;width:14.4pt;height:8.7pt;z-index:251657216;visibility:visible;mso-wrap-style:square;mso-width-percent:0;mso-height-percent:0;mso-wrap-distance-left:9pt;mso-wrap-distance-top:0;mso-wrap-distance-right:9pt;mso-wrap-distance-bottom:0;mso-position-horizontal:absolute;mso-position-horizontal-relative:text;mso-position-vertical:absolute;mso-position-vertical-relative:text;mso-width-percent:0;mso-height-percent:0;mso-width-relative:margin;mso-height-relative:margin;v-text-anchor:middle" o:gfxdata="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" filled="f" strokecolor="black [3213]" strokeweight="1pt"/>
+                    <v:rect w14:anchorId="744D4C31" id="Rectangle 43" o:spid="_x0000_s1026" style="position:absolute;margin-left:0;margin-top:1.55pt;width:14.4pt;height:8.7pt;z-index:251657216;visibility:visible;mso-wrap-style:square;mso-width-percent:0;mso-height-percent:0;mso-wrap-distance-left:9pt;mso-wrap-distance-top:0;mso-wrap-distance-right:9pt;mso-wrap-distance-bottom:0;mso-position-horizontal:absolute;mso-position-horizontal-relative:text;mso-position-vertical:absolute;mso-position-vertical-relative:text;mso-width-percent:0;mso-height-percent:0;mso-width-relative:margin;mso-height-relative:margin;v-text-anchor:middle" o:gfxdata="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" filled="f" strokecolor="black [3213]" strokeweight="1pt"/>
                   </w:pict>
                 </mc:Fallback>
               </mc:AlternateContent>
@@ -1353,7 +1389,7 @@
                 </mc:Choice>
                 <mc:Fallback>
                   <w:pict>
-                    <v:rect w14:anchorId="3A14418A" id="Rectangle 3" o:spid="_x0000_s1026" style="position:absolute;margin-left:.2pt;margin-top:1.85pt;width:14.4pt;height:8.75pt;z-index:251661312;visibility:visible;mso-wrap-style:square;mso-width-percent:0;mso-height-percent:0;mso-wrap-distance-left:9pt;mso-wrap-distance-top:0;mso-wrap-distance-right:9pt;mso-wrap-distance-bottom:0;mso-position-horizontal:absolute;mso-position-horizontal-relative:text;mso-position-vertical:absolute;mso-position-vertical-relative:text;mso-width-percent:0;mso-height-percent:0;mso-width-relative:margin;mso-height-relative:margin;v-text-anchor:middle" o:gfxdata="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" filled="f" strokecolor="black [3213]" strokeweight="1pt"/>
+                    <v:rect w14:anchorId="4E7E5EDC" id="Rectangle 3" o:spid="_x0000_s1026" style="position:absolute;margin-left:.2pt;margin-top:1.85pt;width:14.4pt;height:8.75pt;z-index:251661312;visibility:visible;mso-wrap-style:square;mso-width-percent:0;mso-height-percent:0;mso-wrap-distance-left:9pt;mso-wrap-distance-top:0;mso-wrap-distance-right:9pt;mso-wrap-distance-bottom:0;mso-position-horizontal:absolute;mso-position-horizontal-relative:text;mso-position-vertical:absolute;mso-position-vertical-relative:text;mso-width-percent:0;mso-height-percent:0;mso-width-relative:margin;mso-height-relative:margin;v-text-anchor:middle" o:gfxdata="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" filled="f" strokecolor="black [3213]" strokeweight="1pt"/>
                   </w:pict>
                 </mc:Fallback>
               </mc:AlternateContent>
@@ -1476,7 +1512,7 @@
                 </mc:Choice>
                 <mc:Fallback>
                   <w:pict>
-                    <v:rect w14:anchorId="327D4857" id="Rectangle 45" o:spid="_x0000_s1026" style="position:absolute;margin-left:0;margin-top:.95pt;width:14.4pt;height:8.7pt;z-index:251659264;visibility:visible;mso-wrap-style:square;mso-width-percent:0;mso-height-percent:0;mso-wrap-distance-left:9pt;mso-wrap-distance-top:0;mso-wrap-distance-right:9pt;mso-wrap-distance-bottom:0;mso-position-horizontal:absolute;mso-position-horizontal-relative:text;mso-position-vertical:absolute;mso-position-vertical-relative:text;mso-width-percent:0;mso-height-percent:0;mso-width-relative:margin;mso-height-relative:margin;v-text-anchor:middle" o:gfxdata="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" filled="f" strokecolor="black [3213]" strokeweight="1pt"/>
+                    <v:rect w14:anchorId="66F1C9F8" id="Rectangle 45" o:spid="_x0000_s1026" style="position:absolute;margin-left:0;margin-top:.95pt;width:14.4pt;height:8.7pt;z-index:251659264;visibility:visible;mso-wrap-style:square;mso-width-percent:0;mso-height-percent:0;mso-wrap-distance-left:9pt;mso-wrap-distance-top:0;mso-wrap-distance-right:9pt;mso-wrap-distance-bottom:0;mso-position-horizontal:absolute;mso-position-horizontal-relative:text;mso-position-vertical:absolute;mso-position-vertical-relative:text;mso-width-percent:0;mso-height-percent:0;mso-width-relative:margin;mso-height-relative:margin;v-text-anchor:middle" o:gfxdata="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" filled="f" strokecolor="black [3213]" strokeweight="1pt"/>
                   </w:pict>
                 </mc:Fallback>
               </mc:AlternateContent>
@@ -1584,7 +1620,7 @@
                 </mc:Choice>
                 <mc:Fallback>
                   <w:pict>
-                    <v:rect w14:anchorId="5E542E4A" id="Rectangle 19" o:spid="_x0000_s1026" style="position:absolute;margin-left:.2pt;margin-top:1.1pt;width:14.4pt;height:8.7pt;z-index:251645952;visibility:visible;mso-wrap-style:square;mso-width-percent:0;mso-height-percent:0;mso-wrap-distance-left:9pt;mso-wrap-distance-top:0;mso-wrap-distance-right:9pt;mso-wrap-distance-bottom:0;mso-position-horizontal:absolute;mso-position-horizontal-relative:text;mso-position-vertical:absolute;mso-position-vertical-relative:text;mso-width-percent:0;mso-height-percent:0;mso-width-relative:margin;mso-height-relative:margin;v-text-anchor:middle" o:gfxdata="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" filled="f" strokecolor="black [3213]" strokeweight="1pt"/>
+                    <v:rect w14:anchorId="799F6E7C" id="Rectangle 19" o:spid="_x0000_s1026" style="position:absolute;margin-left:.2pt;margin-top:1.1pt;width:14.4pt;height:8.7pt;z-index:251645952;visibility:visible;mso-wrap-style:square;mso-width-percent:0;mso-height-percent:0;mso-wrap-distance-left:9pt;mso-wrap-distance-top:0;mso-wrap-distance-right:9pt;mso-wrap-distance-bottom:0;mso-position-horizontal:absolute;mso-position-horizontal-relative:text;mso-position-vertical:absolute;mso-position-vertical-relative:text;mso-width-percent:0;mso-height-percent:0;mso-width-relative:margin;mso-height-relative:margin;v-text-anchor:middle" o:gfxdata="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" filled="f" strokecolor="black [3213]" strokeweight="1pt"/>
                   </w:pict>
                 </mc:Fallback>
               </mc:AlternateContent>
@@ -1685,7 +1721,7 @@
                 </mc:Choice>
                 <mc:Fallback>
                   <w:pict>
-                    <v:rect w14:anchorId="6CD4C7A5" id="Rectangle 21" o:spid="_x0000_s1026" style="position:absolute;margin-left:.15pt;margin-top:1.1pt;width:14.4pt;height:8.7pt;z-index:251646976;visibility:visible;mso-wrap-style:square;mso-width-percent:0;mso-height-percent:0;mso-wrap-distance-left:9pt;mso-wrap-distance-top:0;mso-wrap-distance-right:9pt;mso-wrap-distance-bottom:0;mso-position-horizontal:absolute;mso-position-horizontal-relative:text;mso-position-vertical:absolute;mso-position-vertical-relative:text;mso-width-percent:0;mso-height-percent:0;mso-width-relative:margin;mso-height-relative:margin;v-text-anchor:middle" o:gfxdata="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" filled="f" strokecolor="black [3213]" strokeweight="1pt"/>
+                    <v:rect w14:anchorId="0B1EB2F6" id="Rectangle 21" o:spid="_x0000_s1026" style="position:absolute;margin-left:.15pt;margin-top:1.1pt;width:14.4pt;height:8.7pt;z-index:251646976;visibility:visible;mso-wrap-style:square;mso-width-percent:0;mso-height-percent:0;mso-wrap-distance-left:9pt;mso-wrap-distance-top:0;mso-wrap-distance-right:9pt;mso-wrap-distance-bottom:0;mso-position-horizontal:absolute;mso-position-horizontal-relative:text;mso-position-vertical:absolute;mso-position-vertical-relative:text;mso-width-percent:0;mso-height-percent:0;mso-width-relative:margin;mso-height-relative:margin;v-text-anchor:middle" o:gfxdata="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" filled="f" strokecolor="black [3213]" strokeweight="1pt"/>
                   </w:pict>
                 </mc:Fallback>
               </mc:AlternateContent>
@@ -1786,7 +1822,7 @@
                 </mc:Choice>
                 <mc:Fallback>
                   <w:pict>
-                    <v:rect w14:anchorId="7AEECECF" id="Rectangle 22" o:spid="_x0000_s1026" style="position:absolute;margin-left:.15pt;margin-top:1.35pt;width:14.4pt;height:8.7pt;z-index:251648000;visibility:visible;mso-wrap-style:square;mso-width-percent:0;mso-height-percent:0;mso-wrap-distance-left:9pt;mso-wrap-distance-top:0;mso-wrap-distance-right:9pt;mso-wrap-distance-bottom:0;mso-position-horizontal:absolute;mso-position-horizontal-relative:text;mso-position-vertical:absolute;mso-position-vertical-relative:text;mso-width-percent:0;mso-height-percent:0;mso-width-relative:margin;mso-height-relative:margin;v-text-anchor:middle" o:gfxdata="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" filled="f" strokecolor="black [3213]" strokeweight="1pt"/>
+                    <v:rect w14:anchorId="5AFF088F" id="Rectangle 22" o:spid="_x0000_s1026" style="position:absolute;margin-left:.15pt;margin-top:1.35pt;width:14.4pt;height:8.7pt;z-index:251648000;visibility:visible;mso-wrap-style:square;mso-width-percent:0;mso-height-percent:0;mso-wrap-distance-left:9pt;mso-wrap-distance-top:0;mso-wrap-distance-right:9pt;mso-wrap-distance-bottom:0;mso-position-horizontal:absolute;mso-position-horizontal-relative:text;mso-position-vertical:absolute;mso-position-vertical-relative:text;mso-width-percent:0;mso-height-percent:0;mso-width-relative:margin;mso-height-relative:margin;v-text-anchor:middle" o:gfxdata="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" filled="f" strokecolor="black [3213]" strokeweight="1pt"/>
                   </w:pict>
                 </mc:Fallback>
               </mc:AlternateContent>
@@ -1920,7 +1956,7 @@
                 </mc:Choice>
                 <mc:Fallback>
                   <w:pict>
-                    <v:rect w14:anchorId="2771C332" id="Rectangle 23" o:spid="_x0000_s1026" style="position:absolute;margin-left:-.2pt;margin-top:1.5pt;width:14.4pt;height:8.7pt;z-index:251649024;visibility:visible;mso-wrap-style:square;mso-width-percent:0;mso-height-percent:0;mso-wrap-distance-left:9pt;mso-wrap-distance-top:0;mso-wrap-distance-right:9pt;mso-wrap-distance-bottom:0;mso-position-horizontal:absolute;mso-position-horizontal-relative:text;mso-position-vertical:absolute;mso-position-vertical-relative:text;mso-width-percent:0;mso-height-percent:0;mso-width-relative:margin;mso-height-relative:margin;v-text-anchor:middle" o:gfxdata="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" filled="f" strokecolor="black [3213]" strokeweight="1pt"/>
+                    <v:rect w14:anchorId="05147AE0" id="Rectangle 23" o:spid="_x0000_s1026" style="position:absolute;margin-left:-.2pt;margin-top:1.5pt;width:14.4pt;height:8.7pt;z-index:251649024;visibility:visible;mso-wrap-style:square;mso-width-percent:0;mso-height-percent:0;mso-wrap-distance-left:9pt;mso-wrap-distance-top:0;mso-wrap-distance-right:9pt;mso-wrap-distance-bottom:0;mso-position-horizontal:absolute;mso-position-horizontal-relative:text;mso-position-vertical:absolute;mso-position-vertical-relative:text;mso-width-percent:0;mso-height-percent:0;mso-width-relative:margin;mso-height-relative:margin;v-text-anchor:middle" o:gfxdata="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" filled="f" strokecolor="black [3213]" strokeweight="1pt"/>
                   </w:pict>
                 </mc:Fallback>
               </mc:AlternateContent>
@@ -2021,7 +2057,7 @@
                 </mc:Choice>
                 <mc:Fallback>
                   <w:pict>
-                    <v:rect w14:anchorId="253957ED" id="Rectangle 25" o:spid="_x0000_s1026" style="position:absolute;margin-left:-.2pt;margin-top:1.25pt;width:14.4pt;height:8.7pt;z-index:251650048;visibility:visible;mso-wrap-style:square;mso-width-percent:0;mso-height-percent:0;mso-wrap-distance-left:9pt;mso-wrap-distance-top:0;mso-wrap-distance-right:9pt;mso-wrap-distance-bottom:0;mso-position-horizontal:absolute;mso-position-horizontal-relative:text;mso-position-vertical:absolute;mso-position-vertical-relative:text;mso-width-percent:0;mso-height-percent:0;mso-width-relative:margin;mso-height-relative:margin;v-text-anchor:middle" o:gfxdata="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" filled="f" strokecolor="black [3213]" strokeweight="1pt"/>
+                    <v:rect w14:anchorId="3E85CAC8" id="Rectangle 25" o:spid="_x0000_s1026" style="position:absolute;margin-left:-.2pt;margin-top:1.25pt;width:14.4pt;height:8.7pt;z-index:251650048;visibility:visible;mso-wrap-style:square;mso-width-percent:0;mso-height-percent:0;mso-wrap-distance-left:9pt;mso-wrap-distance-top:0;mso-wrap-distance-right:9pt;mso-wrap-distance-bottom:0;mso-position-horizontal:absolute;mso-position-horizontal-relative:text;mso-position-vertical:absolute;mso-position-vertical-relative:text;mso-width-percent:0;mso-height-percent:0;mso-width-relative:margin;mso-height-relative:margin;v-text-anchor:middle" o:gfxdata="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" filled="f" strokecolor="black [3213]" strokeweight="1pt"/>
                   </w:pict>
                 </mc:Fallback>
               </mc:AlternateContent>
@@ -2122,7 +2158,7 @@
                 </mc:Choice>
                 <mc:Fallback>
                   <w:pict>
-                    <v:rect w14:anchorId="1DE1B414" id="Rectangle 32" o:spid="_x0000_s1026" style="position:absolute;margin-left:-.4pt;margin-top:.9pt;width:14.4pt;height:8.7pt;z-index:251651072;visibility:visible;mso-wrap-style:square;mso-width-percent:0;mso-height-percent:0;mso-wrap-distance-left:9pt;mso-wrap-distance-top:0;mso-wrap-distance-right:9pt;mso-wrap-distance-bottom:0;mso-position-horizontal:absolute;mso-position-horizontal-relative:text;mso-position-vertical:absolute;mso-position-vertical-relative:text;mso-width-percent:0;mso-height-percent:0;mso-width-relative:margin;mso-height-relative:margin;v-text-anchor:middle" o:gfxdata="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" filled="f" strokecolor="black [3213]" strokeweight="1pt"/>
+                    <v:rect w14:anchorId="10B8A434" id="Rectangle 32" o:spid="_x0000_s1026" style="position:absolute;margin-left:-.4pt;margin-top:.9pt;width:14.4pt;height:8.7pt;z-index:251651072;visibility:visible;mso-wrap-style:square;mso-width-percent:0;mso-height-percent:0;mso-wrap-distance-left:9pt;mso-wrap-distance-top:0;mso-wrap-distance-right:9pt;mso-wrap-distance-bottom:0;mso-position-horizontal:absolute;mso-position-horizontal-relative:text;mso-position-vertical:absolute;mso-position-vertical-relative:text;mso-width-percent:0;mso-height-percent:0;mso-width-relative:margin;mso-height-relative:margin;v-text-anchor:middle" o:gfxdata="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" filled="f" strokecolor="black [3213]" strokeweight="1pt"/>
                   </w:pict>
                 </mc:Fallback>
               </mc:AlternateContent>
@@ -2221,7 +2257,7 @@
                 </mc:Choice>
                 <mc:Fallback>
                   <w:pict>
-                    <v:rect w14:anchorId="7D95EAF2" id="Rectangle 37" o:spid="_x0000_s1026" style="position:absolute;margin-left:-.6pt;margin-top:.4pt;width:14.4pt;height:8.7pt;z-index:251652096;visibility:visible;mso-wrap-style:square;mso-width-percent:0;mso-height-percent:0;mso-wrap-distance-left:9pt;mso-wrap-distance-top:0;mso-wrap-distance-right:9pt;mso-wrap-distance-bottom:0;mso-position-horizontal:absolute;mso-position-horizontal-relative:text;mso-position-vertical:absolute;mso-position-vertical-relative:text;mso-width-percent:0;mso-height-percent:0;mso-width-relative:margin;mso-height-relative:margin;v-text-anchor:middle" o:gfxdata="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" filled="f" strokecolor="black [3213]" strokeweight="1pt"/>
+                    <v:rect w14:anchorId="080159F4" id="Rectangle 37" o:spid="_x0000_s1026" style="position:absolute;margin-left:-.6pt;margin-top:.4pt;width:14.4pt;height:8.7pt;z-index:251652096;visibility:visible;mso-wrap-style:square;mso-width-percent:0;mso-height-percent:0;mso-wrap-distance-left:9pt;mso-wrap-distance-top:0;mso-wrap-distance-right:9pt;mso-wrap-distance-bottom:0;mso-position-horizontal:absolute;mso-position-horizontal-relative:text;mso-position-vertical:absolute;mso-position-vertical-relative:text;mso-width-percent:0;mso-height-percent:0;mso-width-relative:margin;mso-height-relative:margin;v-text-anchor:middle" o:gfxdata="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" filled="f" strokecolor="black [3213]" strokeweight="1pt"/>
                   </w:pict>
                 </mc:Fallback>
               </mc:AlternateContent>
@@ -2328,7 +2364,7 @@
                 </mc:Choice>
                 <mc:Fallback>
                   <w:pict>
-                    <v:rect w14:anchorId="15F6250A" id="Rectangle 2" o:spid="_x0000_s1026" style="position:absolute;margin-left:-2.35pt;margin-top:1.6pt;width:16.35pt;height:8.7pt;z-index:251642880;visibility:visible;mso-wrap-style:square;mso-width-percent:0;mso-height-percent:0;mso-wrap-distance-left:9pt;mso-wrap-distance-top:0;mso-wrap-distance-right:9pt;mso-wrap-distance-bottom:0;mso-position-horizontal:absolute;mso-position-horizontal-relative:text;mso-position-vertical:absolute;mso-position-vertical-relative:text;mso-width-percent:0;mso-height-percent:0;mso-width-relative:margin;mso-height-relative:margin;v-text-anchor:middle" o:gfxdata="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" filled="f" strokecolor="black [3213]" strokeweight="1pt"/>
+                    <v:rect w14:anchorId="612D067A" id="Rectangle 2" o:spid="_x0000_s1026" style="position:absolute;margin-left:-2.35pt;margin-top:1.6pt;width:16.35pt;height:8.7pt;z-index:251642880;visibility:visible;mso-wrap-style:square;mso-width-percent:0;mso-height-percent:0;mso-wrap-distance-left:9pt;mso-wrap-distance-top:0;mso-wrap-distance-right:9pt;mso-wrap-distance-bottom:0;mso-position-horizontal:absolute;mso-position-horizontal-relative:text;mso-position-vertical:absolute;mso-position-vertical-relative:text;mso-width-percent:0;mso-height-percent:0;mso-width-relative:margin;mso-height-relative:margin;v-text-anchor:middle" o:gfxdata="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" filled="f" strokecolor="black [3213]" strokeweight="1pt"/>
                   </w:pict>
                 </mc:Fallback>
               </mc:AlternateContent>
@@ -2445,7 +2481,7 @@
                 </mc:Choice>
                 <mc:Fallback>
                   <w:pict>
-                    <v:rect w14:anchorId="11DE977D" id="Rectangle 7" o:spid="_x0000_s1026" style="position:absolute;margin-left:-2.35pt;margin-top:1.65pt;width:16.35pt;height:8.7pt;z-index:251643904;visibility:visible;mso-wrap-style:square;mso-width-percent:0;mso-height-percent:0;mso-wrap-distance-left:9pt;mso-wrap-distance-top:0;mso-wrap-distance-right:9pt;mso-wrap-distance-bottom:0;mso-position-horizontal:absolute;mso-position-horizontal-relative:text;mso-position-vertical:absolute;mso-position-vertical-relative:text;mso-width-percent:0;mso-height-percent:0;mso-width-relative:margin;mso-height-relative:margin;v-text-anchor:middle" o:gfxdata="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" filled="f" strokecolor="black [3213]" strokeweight="1pt"/>
+                    <v:rect w14:anchorId="267C6CAC" id="Rectangle 7" o:spid="_x0000_s1026" style="position:absolute;margin-left:-2.35pt;margin-top:1.65pt;width:16.35pt;height:8.7pt;z-index:251643904;visibility:visible;mso-wrap-style:square;mso-width-percent:0;mso-height-percent:0;mso-wrap-distance-left:9pt;mso-wrap-distance-top:0;mso-wrap-distance-right:9pt;mso-wrap-distance-bottom:0;mso-position-horizontal:absolute;mso-position-horizontal-relative:text;mso-position-vertical:absolute;mso-position-vertical-relative:text;mso-width-percent:0;mso-height-percent:0;mso-width-relative:margin;mso-height-relative:margin;v-text-anchor:middle" o:gfxdata="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" filled="f" strokecolor="black [3213]" strokeweight="1pt"/>
                   </w:pict>
                 </mc:Fallback>
               </mc:AlternateContent>
@@ -2595,7 +2631,7 @@
                 </mc:Choice>
                 <mc:Fallback>
                   <w:pict>
-                    <v:rect w14:anchorId="5AC7DEAF" id="Rectangle 9" o:spid="_x0000_s1026" style="position:absolute;margin-left:-2.6pt;margin-top:1.75pt;width:16.35pt;height:8.7pt;z-index:251644928;visibility:visible;mso-wrap-style:square;mso-width-percent:0;mso-height-percent:0;mso-wrap-distance-left:9pt;mso-wrap-distance-top:0;mso-wrap-distance-right:9pt;mso-wrap-distance-bottom:0;mso-position-horizontal:absolute;mso-position-horizontal-relative:text;mso-position-vertical:absolute;mso-position-vertical-relative:text;mso-width-percent:0;mso-height-percent:0;mso-width-relative:margin;mso-height-relative:margin;v-text-anchor:middle" o:gfxdata="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" filled="f" strokecolor="black [3213]" strokeweight="1pt"/>
+                    <v:rect w14:anchorId="3B638778" id="Rectangle 9" o:spid="_x0000_s1026" style="position:absolute;margin-left:-2.6pt;margin-top:1.75pt;width:16.35pt;height:8.7pt;z-index:251644928;visibility:visible;mso-wrap-style:square;mso-width-percent:0;mso-height-percent:0;mso-wrap-distance-left:9pt;mso-wrap-distance-top:0;mso-wrap-distance-right:9pt;mso-wrap-distance-bottom:0;mso-position-horizontal:absolute;mso-position-horizontal-relative:text;mso-position-vertical:absolute;mso-position-vertical-relative:text;mso-width-percent:0;mso-height-percent:0;mso-width-relative:margin;mso-height-relative:margin;v-text-anchor:middle" o:gfxdata="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" filled="f" strokecolor="black [3213]" strokeweight="1pt"/>
                   </w:pict>
                 </mc:Fallback>
               </mc:AlternateContent>
@@ -2720,7 +2756,7 @@
                 </mc:Choice>
                 <mc:Fallback>
                   <w:pict>
-                    <v:rect w14:anchorId="5481A721" id="Rectangle 1" o:spid="_x0000_s1026" style="position:absolute;margin-left:-2.6pt;margin-top:11.8pt;width:16.35pt;height:8.7pt;z-index:251660288;visibility:visible;mso-wrap-style:square;mso-width-percent:0;mso-height-percent:0;mso-wrap-distance-left:9pt;mso-wrap-distance-top:0;mso-wrap-distance-right:9pt;mso-wrap-distance-bottom:0;mso-position-horizontal:absolute;mso-position-horizontal-relative:text;mso-position-vertical:absolute;mso-position-vertical-relative:text;mso-width-percent:0;mso-height-percent:0;mso-width-relative:margin;mso-height-relative:margin;v-text-anchor:middle" o:gfxdata="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" filled="f" strokecolor="black [3213]" strokeweight="1pt"/>
+                    <v:rect w14:anchorId="3678319D" id="Rectangle 1" o:spid="_x0000_s1026" style="position:absolute;margin-left:-2.6pt;margin-top:11.8pt;width:16.35pt;height:8.7pt;z-index:251660288;visibility:visible;mso-wrap-style:square;mso-width-percent:0;mso-height-percent:0;mso-wrap-distance-left:9pt;mso-wrap-distance-top:0;mso-wrap-distance-right:9pt;mso-wrap-distance-bottom:0;mso-position-horizontal:absolute;mso-position-horizontal-relative:text;mso-position-vertical:absolute;mso-position-vertical-relative:text;mso-width-percent:0;mso-height-percent:0;mso-width-relative:margin;mso-height-relative:margin;v-text-anchor:middle" o:gfxdata="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" filled="f" strokecolor="black [3213]" strokeweight="1pt"/>
                   </w:pict>
                 </mc:Fallback>
               </mc:AlternateContent>
@@ -2853,7 +2889,7 @@
                 </mc:Choice>
                 <mc:Fallback>
                   <w:pict>
-                    <v:rect w14:anchorId="23BAFF3B" id="Rectangle 44" o:spid="_x0000_s1026" style="position:absolute;margin-left:-2.5pt;margin-top:12.15pt;width:16.35pt;height:8.7pt;z-index:251658240;visibility:visible;mso-wrap-style:square;mso-width-percent:0;mso-height-percent:0;mso-wrap-distance-left:9pt;mso-wrap-distance-top:0;mso-wrap-distance-right:9pt;mso-wrap-distance-bottom:0;mso-position-horizontal:absolute;mso-position-horizontal-relative:text;mso-position-vertical:absolute;mso-position-vertical-relative:text;mso-width-percent:0;mso-height-percent:0;mso-width-relative:margin;mso-height-relative:margin;v-text-anchor:middle" o:gfxdata="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" filled="f" strokecolor="black [3213]" strokeweight="1pt"/>
+                    <v:rect w14:anchorId="61BD3548" id="Rectangle 44" o:spid="_x0000_s1026" style="position:absolute;margin-left:-2.5pt;margin-top:12.15pt;width:16.35pt;height:8.7pt;z-index:251658240;visibility:visible;mso-wrap-style:square;mso-width-percent:0;mso-height-percent:0;mso-wrap-distance-left:9pt;mso-wrap-distance-top:0;mso-wrap-distance-right:9pt;mso-wrap-distance-bottom:0;mso-position-horizontal:absolute;mso-position-horizontal-relative:text;mso-position-vertical:absolute;mso-position-vertical-relative:text;mso-width-percent:0;mso-height-percent:0;mso-width-relative:margin;mso-height-relative:margin;v-text-anchor:middle" o:gfxdata="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" filled="f" strokecolor="black [3213]" strokeweight="1pt"/>
                   </w:pict>
                 </mc:Fallback>
               </mc:AlternateContent>
@@ -3025,7 +3061,25 @@
                 <w:sz w:val="20"/>
                 <w:szCs w:val="20"/>
               </w:rPr>
-              <w:t>{Date_started}</w:t>
+              <w:t>{</w:t>
+            </w:r>
+            <w:proofErr w:type="spellStart"/>
+            <w:r>
+              <w:rPr>
+                <w:rFonts w:ascii="Arial Narrow" w:hAnsi="Arial Narrow"/>
+                <w:sz w:val="20"/>
+                <w:szCs w:val="20"/>
+              </w:rPr>
+              <w:t>Date_started</w:t>
+            </w:r>
+            <w:proofErr w:type="spellEnd"/>
+            <w:r>
+              <w:rPr>
+                <w:rFonts w:ascii="Arial Narrow" w:hAnsi="Arial Narrow"/>
+                <w:sz w:val="20"/>
+                <w:szCs w:val="20"/>
+              </w:rPr>
+              <w:t>}</w:t>
             </w:r>
           </w:p>
         </w:tc>
@@ -3878,7 +3932,7 @@
                 </mc:Choice>
                 <mc:Fallback>
                   <w:pict>
-                    <v:rect w14:anchorId="050BDACD" id="Rectangle 5" o:spid="_x0000_s1026" style="position:absolute;margin-left:.2pt;margin-top:.85pt;width:16.35pt;height:8.7pt;z-index:251662336;visibility:visible;mso-wrap-style:square;mso-width-percent:0;mso-height-percent:0;mso-wrap-distance-left:9pt;mso-wrap-distance-top:0;mso-wrap-distance-right:9pt;mso-wrap-distance-bottom:0;mso-position-horizontal:absolute;mso-position-horizontal-relative:text;mso-position-vertical:absolute;mso-position-vertical-relative:text;mso-width-percent:0;mso-height-percent:0;mso-width-relative:margin;mso-height-relative:margin;v-text-anchor:middle" o:gfxdata="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" filled="f" strokecolor="black [3213]" strokeweight="1pt"/>
+                    <v:rect w14:anchorId="1C230167" id="Rectangle 5" o:spid="_x0000_s1026" style="position:absolute;margin-left:.2pt;margin-top:.85pt;width:16.35pt;height:8.7pt;z-index:251662336;visibility:visible;mso-wrap-style:square;mso-width-percent:0;mso-height-percent:0;mso-wrap-distance-left:9pt;mso-wrap-distance-top:0;mso-wrap-distance-right:9pt;mso-wrap-distance-bottom:0;mso-position-horizontal:absolute;mso-position-horizontal-relative:text;mso-position-vertical:absolute;mso-position-vertical-relative:text;mso-width-percent:0;mso-height-percent:0;mso-width-relative:margin;mso-height-relative:margin;v-text-anchor:middle" o:gfxdata="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" filled="f" strokecolor="black [3213]" strokeweight="1pt"/>
                   </w:pict>
                 </mc:Fallback>
               </mc:AlternateContent>
@@ -3962,7 +4016,7 @@
                 </mc:Choice>
                 <mc:Fallback>
                   <w:pict>
-                    <v:rect w14:anchorId="7B2345CE" id="Rectangle 6" o:spid="_x0000_s1026" style="position:absolute;margin-left:-.05pt;margin-top:17.25pt;width:16.35pt;height:8.7pt;z-index:251663360;visibility:visible;mso-wrap-style:square;mso-width-percent:0;mso-height-percent:0;mso-wrap-distance-left:9pt;mso-wrap-distance-top:0;mso-wrap-distance-right:9pt;mso-wrap-distance-bottom:0;mso-position-horizontal:absolute;mso-position-horizontal-relative:text;mso-position-vertical:absolute;mso-position-vertical-relative:text;mso-width-percent:0;mso-height-percent:0;mso-width-relative:margin;mso-height-relative:margin;v-text-anchor:middle" o:gfxdata="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" filled="f" strokecolor="black [3213]" strokeweight="1pt"/>
+                    <v:rect w14:anchorId="7502EB7A" id="Rectangle 6" o:spid="_x0000_s1026" style="position:absolute;margin-left:-.05pt;margin-top:17.25pt;width:16.35pt;height:8.7pt;z-index:251663360;visibility:visible;mso-wrap-style:square;mso-width-percent:0;mso-height-percent:0;mso-wrap-distance-left:9pt;mso-wrap-distance-top:0;mso-wrap-distance-right:9pt;mso-wrap-distance-bottom:0;mso-position-horizontal:absolute;mso-position-horizontal-relative:text;mso-position-vertical:absolute;mso-position-vertical-relative:text;mso-width-percent:0;mso-height-percent:0;mso-width-relative:margin;mso-height-relative:margin;v-text-anchor:middle" o:gfxdata="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" filled="f" strokecolor="black [3213]" strokeweight="1pt"/>
                   </w:pict>
                 </mc:Fallback>
               </mc:AlternateContent>
@@ -4063,7 +4117,27 @@
                 <w:sz w:val="26"/>
                 <w:szCs w:val="26"/>
               </w:rPr>
-              <w:t>{Job_particulars}</w:t>
+              <w:t>{</w:t>
+            </w:r>
+            <w:proofErr w:type="spellStart"/>
+            <w:r>
+              <w:rPr>
+                <w:rFonts w:ascii="Arial Narrow" w:hAnsi="Arial Narrow"/>
+                <w:color w:val="000000" w:themeColor="text1"/>
+                <w:sz w:val="26"/>
+                <w:szCs w:val="26"/>
+              </w:rPr>
+              <w:t>Job_particulars</w:t>
+            </w:r>
+            <w:proofErr w:type="spellEnd"/>
+            <w:r>
+              <w:rPr>
+                <w:rFonts w:ascii="Arial Narrow" w:hAnsi="Arial Narrow"/>
+                <w:color w:val="000000" w:themeColor="text1"/>
+                <w:sz w:val="26"/>
+                <w:szCs w:val="26"/>
+              </w:rPr>
+              <w:t>}</w:t>
             </w:r>
           </w:p>
           <w:p>
@@ -4190,23 +4264,7 @@
                 <w:sz w:val="20"/>
                 <w:szCs w:val="20"/>
               </w:rPr>
-              <w:t>{Personnel_</w:t>
-            </w:r>
-            <w:r>
-              <w:rPr>
-                <w:rFonts w:ascii="Arial Narrow" w:hAnsi="Arial Narrow"/>
-                <w:sz w:val="20"/>
-                <w:szCs w:val="20"/>
-              </w:rPr>
-              <w:t>6</w:t>
-            </w:r>
-            <w:r>
-              <w:rPr>
-                <w:rFonts w:ascii="Arial Narrow" w:hAnsi="Arial Narrow"/>
-                <w:sz w:val="20"/>
-                <w:szCs w:val="20"/>
-              </w:rPr>
-              <w:t>}</w:t>
+              <w:t>{Personnel_6}</w:t>
             </w:r>
           </w:p>
         </w:tc>
@@ -4263,23 +4321,7 @@
                 <w:sz w:val="20"/>
                 <w:szCs w:val="20"/>
               </w:rPr>
-              <w:t>{Personnel_</w:t>
-            </w:r>
-            <w:r>
-              <w:rPr>
-                <w:rFonts w:ascii="Arial Narrow" w:hAnsi="Arial Narrow"/>
-                <w:sz w:val="20"/>
-                <w:szCs w:val="20"/>
-              </w:rPr>
-              <w:t>7</w:t>
-            </w:r>
-            <w:r>
-              <w:rPr>
-                <w:rFonts w:ascii="Arial Narrow" w:hAnsi="Arial Narrow"/>
-                <w:sz w:val="20"/>
-                <w:szCs w:val="20"/>
-              </w:rPr>
-              <w:t>}</w:t>
+              <w:t>{Personnel_7}</w:t>
             </w:r>
           </w:p>
         </w:tc>
@@ -4336,23 +4378,7 @@
                 <w:sz w:val="20"/>
                 <w:szCs w:val="20"/>
               </w:rPr>
-              <w:t>{Personnel_</w:t>
-            </w:r>
-            <w:r>
-              <w:rPr>
-                <w:rFonts w:ascii="Arial Narrow" w:hAnsi="Arial Narrow"/>
-                <w:sz w:val="20"/>
-                <w:szCs w:val="20"/>
-              </w:rPr>
-              <w:t>8</w:t>
-            </w:r>
-            <w:r>
-              <w:rPr>
-                <w:rFonts w:ascii="Arial Narrow" w:hAnsi="Arial Narrow"/>
-                <w:sz w:val="20"/>
-                <w:szCs w:val="20"/>
-              </w:rPr>
-              <w:t>}</w:t>
+              <w:t>{Personnel_8}</w:t>
             </w:r>
           </w:p>
         </w:tc>
@@ -4409,23 +4435,7 @@
                 <w:sz w:val="20"/>
                 <w:szCs w:val="20"/>
               </w:rPr>
-              <w:t>{Personnel_</w:t>
-            </w:r>
-            <w:r>
-              <w:rPr>
-                <w:rFonts w:ascii="Arial Narrow" w:hAnsi="Arial Narrow"/>
-                <w:sz w:val="20"/>
-                <w:szCs w:val="20"/>
-              </w:rPr>
-              <w:t>9</w:t>
-            </w:r>
-            <w:r>
-              <w:rPr>
-                <w:rFonts w:ascii="Arial Narrow" w:hAnsi="Arial Narrow"/>
-                <w:sz w:val="20"/>
-                <w:szCs w:val="20"/>
-              </w:rPr>
-              <w:t>}</w:t>
+              <w:t>{Personnel_9}</w:t>
             </w:r>
           </w:p>
         </w:tc>
@@ -4456,23 +4466,7 @@
                 <w:sz w:val="20"/>
                 <w:szCs w:val="20"/>
               </w:rPr>
-              <w:t>{Personnel_</w:t>
-            </w:r>
-            <w:r>
-              <w:rPr>
-                <w:rFonts w:ascii="Arial Narrow" w:hAnsi="Arial Narrow"/>
-                <w:sz w:val="20"/>
-                <w:szCs w:val="20"/>
-              </w:rPr>
-              <w:t>5</w:t>
-            </w:r>
-            <w:r>
-              <w:rPr>
-                <w:rFonts w:ascii="Arial Narrow" w:hAnsi="Arial Narrow"/>
-                <w:sz w:val="20"/>
-                <w:szCs w:val="20"/>
-              </w:rPr>
-              <w:t>}</w:t>
+              <w:t>{Personnel_5}</w:t>
             </w:r>
           </w:p>
         </w:tc>
@@ -4498,23 +4492,7 @@
                 <w:sz w:val="20"/>
                 <w:szCs w:val="20"/>
               </w:rPr>
-              <w:t>{Personnel_</w:t>
-            </w:r>
-            <w:r>
-              <w:rPr>
-                <w:rFonts w:ascii="Arial Narrow" w:hAnsi="Arial Narrow"/>
-                <w:sz w:val="20"/>
-                <w:szCs w:val="20"/>
-              </w:rPr>
-              <w:t>10</w:t>
-            </w:r>
-            <w:r>
-              <w:rPr>
-                <w:rFonts w:ascii="Arial Narrow" w:hAnsi="Arial Narrow"/>
-                <w:sz w:val="20"/>
-                <w:szCs w:val="20"/>
-              </w:rPr>
-              <w:t>}</w:t>
+              <w:t>{Personnel_10}</w:t>
             </w:r>
           </w:p>
         </w:tc>
@@ -4688,62 +4666,29 @@
                 <w:sz w:val="18"/>
                 <w:szCs w:val="16"/>
               </w:rPr>
-              <w:t>SHERIFF JOHN C. LA MADRID</w:t>
-            </w:r>
-          </w:p>
-          <w:p>
-            <w:pPr>
-              <w:jc w:val="center"/>
-            </w:pPr>
-            <w:r>
-              <w:rPr>
-                <w:rFonts w:ascii="Arial Narrow" w:hAnsi="Arial Narrow"/>
-                <w:sz w:val="18"/>
-                <w:szCs w:val="16"/>
-              </w:rPr>
-              <w:t>General Services Office - Director</w:t>
-            </w:r>
-          </w:p>
-        </w:tc>
-        <w:tc>
-          <w:tcPr>
-            <w:tcW w:w="2723" w:type="dxa"/>
-            <w:vAlign w:val="bottom"/>
-          </w:tcPr>
-          <w:p>
-            <w:pPr>
-              <w:jc w:val="center"/>
-              <w:rPr>
-                <w:rFonts w:ascii="Arial Narrow" w:hAnsi="Arial Narrow"/>
-                <w:sz w:val="16"/>
-                <w:szCs w:val="16"/>
-              </w:rPr>
-            </w:pPr>
-          </w:p>
-        </w:tc>
-        <w:tc>
-          <w:tcPr>
-            <w:tcW w:w="2982" w:type="dxa"/>
-            <w:vAlign w:val="bottom"/>
-          </w:tcPr>
-          <w:p>
-            <w:pPr>
-              <w:jc w:val="center"/>
+              <w:t>{</w:t>
+            </w:r>
+            <w:proofErr w:type="spellStart"/>
+            <w:r>
               <w:rPr>
                 <w:rFonts w:ascii="Arial Narrow" w:hAnsi="Arial Narrow"/>
                 <w:b/>
                 <w:bCs/>
                 <w:sz w:val="18"/>
-              </w:rPr>
-            </w:pPr>
+                <w:szCs w:val="16"/>
+              </w:rPr>
+              <w:t>Approved_by</w:t>
+            </w:r>
+            <w:proofErr w:type="spellEnd"/>
             <w:r>
               <w:rPr>
                 <w:rFonts w:ascii="Arial Narrow" w:hAnsi="Arial Narrow"/>
                 <w:b/>
                 <w:bCs/>
                 <w:sz w:val="18"/>
-              </w:rPr>
-              <w:t>DONATO R. WANAWAN, JR.</w:t>
+                <w:szCs w:val="16"/>
+              </w:rPr>
+              <w:t>}</w:t>
             </w:r>
           </w:p>
           <w:p>
@@ -4751,14 +4696,126 @@
               <w:jc w:val="center"/>
               <w:rPr>
                 <w:rFonts w:ascii="Arial Narrow" w:hAnsi="Arial Narrow"/>
-              </w:rPr>
-            </w:pPr>
-            <w:r>
-              <w:rPr>
-                <w:rFonts w:ascii="Arial Narrow" w:hAnsi="Arial Narrow"/>
                 <w:sz w:val="18"/>
-              </w:rPr>
-              <w:t>GSO-FGMU Head</w:t>
+                <w:szCs w:val="16"/>
+              </w:rPr>
+            </w:pPr>
+            <w:r>
+              <w:rPr>
+                <w:rFonts w:ascii="Arial Narrow" w:hAnsi="Arial Narrow"/>
+                <w:sz w:val="18"/>
+                <w:szCs w:val="16"/>
+              </w:rPr>
+              <w:t>GSO-{</w:t>
+            </w:r>
+            <w:proofErr w:type="spellStart"/>
+            <w:r>
+              <w:rPr>
+                <w:rFonts w:ascii="Arial Narrow" w:hAnsi="Arial Narrow"/>
+                <w:sz w:val="18"/>
+                <w:szCs w:val="16"/>
+              </w:rPr>
+              <w:t>Unit&amp;Role</w:t>
+            </w:r>
+            <w:proofErr w:type="spellEnd"/>
+            <w:r>
+              <w:rPr>
+                <w:rFonts w:ascii="Arial Narrow" w:hAnsi="Arial Narrow"/>
+                <w:sz w:val="18"/>
+                <w:szCs w:val="16"/>
+              </w:rPr>
+              <w:t>}</w:t>
+            </w:r>
+          </w:p>
+        </w:tc>
+        <w:tc>
+          <w:tcPr>
+            <w:tcW w:w="2723" w:type="dxa"/>
+            <w:vAlign w:val="bottom"/>
+          </w:tcPr>
+          <w:p>
+            <w:pPr>
+              <w:jc w:val="center"/>
+              <w:rPr>
+                <w:rFonts w:ascii="Arial Narrow" w:hAnsi="Arial Narrow"/>
+                <w:sz w:val="16"/>
+                <w:szCs w:val="16"/>
+              </w:rPr>
+            </w:pPr>
+          </w:p>
+        </w:tc>
+        <w:tc>
+          <w:tcPr>
+            <w:tcW w:w="2982" w:type="dxa"/>
+            <w:vAlign w:val="bottom"/>
+          </w:tcPr>
+          <w:p>
+            <w:pPr>
+              <w:jc w:val="center"/>
+              <w:rPr>
+                <w:rFonts w:ascii="Arial Narrow" w:hAnsi="Arial Narrow"/>
+                <w:b/>
+                <w:bCs/>
+                <w:sz w:val="18"/>
+              </w:rPr>
+            </w:pPr>
+            <w:r>
+              <w:rPr>
+                <w:rFonts w:ascii="Arial Narrow" w:hAnsi="Arial Narrow"/>
+                <w:b/>
+                <w:bCs/>
+                <w:sz w:val="18"/>
+              </w:rPr>
+              <w:t>{</w:t>
+            </w:r>
+            <w:proofErr w:type="spellStart"/>
+            <w:r>
+              <w:rPr>
+                <w:rFonts w:ascii="Arial Narrow" w:hAnsi="Arial Narrow"/>
+                <w:b/>
+                <w:bCs/>
+                <w:sz w:val="18"/>
+              </w:rPr>
+              <w:t>Issued_by</w:t>
+            </w:r>
+            <w:proofErr w:type="spellEnd"/>
+            <w:r>
+              <w:rPr>
+                <w:rFonts w:ascii="Arial Narrow" w:hAnsi="Arial Narrow"/>
+                <w:b/>
+                <w:bCs/>
+                <w:sz w:val="18"/>
+              </w:rPr>
+              <w:t>}</w:t>
+            </w:r>
+          </w:p>
+          <w:p>
+            <w:pPr>
+              <w:jc w:val="center"/>
+              <w:rPr>
+                <w:rFonts w:ascii="Arial Narrow" w:hAnsi="Arial Narrow"/>
+              </w:rPr>
+            </w:pPr>
+            <w:r>
+              <w:rPr>
+                <w:rFonts w:ascii="Arial Narrow" w:hAnsi="Arial Narrow"/>
+                <w:sz w:val="18"/>
+              </w:rPr>
+              <w:t>GSO-</w:t>
+            </w:r>
+            <w:r>
+              <w:rPr>
+                <w:rFonts w:ascii="Arial Narrow" w:hAnsi="Arial Narrow"/>
+                <w:sz w:val="18"/>
+              </w:rPr>
+              <w:t>{Unit}</w:t>
+            </w:r>
+            <w:r>
+              <w:rPr>
+                <w:rFonts w:ascii="Arial Narrow" w:hAnsi="Arial Narrow"/>
+                <w:sz w:val="18"/>
+              </w:rPr>
+              <w:t xml:space="preserve"> Head</w:t>
             </w:r>
           </w:p>
         </w:tc>
@@ -4810,6 +4867,32 @@
                 <w:szCs w:val="18"/>
               </w:rPr>
               <w:t>Date:</w:t>
+            </w:r>
+            <w:r>
+              <w:rPr>
+                <w:rFonts w:ascii="Arial Narrow" w:hAnsi="Arial Narrow"/>
+                <w:sz w:val="18"/>
+                <w:szCs w:val="18"/>
+              </w:rPr>
+              <w:t xml:space="preserve"> {</w:t>
+            </w:r>
+            <w:proofErr w:type="spellStart"/>
+            <w:r>
+              <w:rPr>
+                <w:rFonts w:ascii="Arial Narrow" w:hAnsi="Arial Narrow"/>
+                <w:sz w:val="18"/>
+                <w:szCs w:val="18"/>
+              </w:rPr>
+              <w:t>Approval_Date</w:t>
+            </w:r>
+            <w:proofErr w:type="spellEnd"/>
+            <w:r>
+              <w:rPr>
+                <w:rFonts w:ascii="Arial Narrow" w:hAnsi="Arial Narrow"/>
+                <w:sz w:val="18"/>
+                <w:szCs w:val="18"/>
+              </w:rPr>
+              <w:t>}</w:t>
             </w:r>
           </w:p>
         </w:tc>
@@ -6479,7 +6562,6 @@
                         <w:p>
                           <w:pPr>
                             <w:pStyle w:val="NoSpacing"/>
-                            <w:jc w:val="center"/>
                             <w:rPr>
                               <w:rFonts w:ascii="Arial" w:hAnsi="Arial" w:cs="Arial"/>
                               <w:b/>
@@ -6488,16 +6570,6 @@
                               <w:szCs w:val="16"/>
                             </w:rPr>
                           </w:pPr>
-                          <w:r>
-                            <w:rPr>
-                              <w:rFonts w:ascii="Arial" w:hAnsi="Arial" w:cs="Arial"/>
-                              <w:b/>
-                              <w:i/>
-                              <w:sz w:val="16"/>
-                              <w:szCs w:val="16"/>
-                            </w:rPr>
-                            <w:t>FACILITIES AND GROUNDS MANAGEMENT UNIT</w:t>
-                          </w:r>
                         </w:p>
                         <w:p>
                           <w:pPr>
@@ -6653,7 +6725,6 @@
                   <w:p>
                     <w:pPr>
                       <w:pStyle w:val="NoSpacing"/>
-                      <w:jc w:val="center"/>
                       <w:rPr>
                         <w:rFonts w:ascii="Arial" w:hAnsi="Arial" w:cs="Arial"/>
                         <w:b/>
@@ -6662,16 +6733,6 @@
                         <w:szCs w:val="16"/>
                       </w:rPr>
                     </w:pPr>
-                    <w:r>
-                      <w:rPr>
-                        <w:rFonts w:ascii="Arial" w:hAnsi="Arial" w:cs="Arial"/>
-                        <w:b/>
-                        <w:i/>
-                        <w:sz w:val="16"/>
-                        <w:szCs w:val="16"/>
-                      </w:rPr>
-                      <w:t>FACILITIES AND GROUNDS MANAGEMENT UNIT</w:t>
-                    </w:r>
                   </w:p>
                   <w:p>
                     <w:pPr>

</xml_diff>